<commit_message>
Added Section On Impact Analysis
</commit_message>
<xml_diff>
--- a/LECTURE 46 : SCHEMA EVOLUTION/Schema_Evolution_Snowflake.docx
+++ b/LECTURE 46 : SCHEMA EVOLUTION/Schema_Evolution_Snowflake.docx
@@ -5188,6 +5188,1744 @@
           <w:b/>
           <w:bCs/>
         </w:rPr>
+        <w:t xml:space="preserve">Impact </w:t>
+      </w:r>
+      <w:proofErr w:type="gramStart"/>
+      <w:r>
+        <w:rPr>
+          <w:rFonts w:cstheme="minorHAnsi"/>
+          <w:b/>
+          <w:bCs/>
+        </w:rPr>
+        <w:t>On</w:t>
+      </w:r>
+      <w:proofErr w:type="gramEnd"/>
+      <w:r>
+        <w:rPr>
+          <w:rFonts w:cstheme="minorHAnsi"/>
+          <w:b/>
+          <w:bCs/>
+        </w:rPr>
+        <w:t xml:space="preserve"> Micro-Partitions</w:t>
+      </w:r>
+    </w:p>
+    <w:p>
+      <w:pPr>
+        <w:rPr>
+          <w:rFonts w:cstheme="minorHAnsi"/>
+          <w:b/>
+          <w:bCs/>
+        </w:rPr>
+      </w:pPr>
+      <w:r>
+        <w:rPr>
+          <w:rFonts w:ascii="Segoe UI Emoji" w:hAnsi="Segoe UI Emoji" w:cs="Segoe UI Emoji"/>
+          <w:b/>
+          <w:bCs/>
+        </w:rPr>
+        <w:t>🔎</w:t>
+      </w:r>
+      <w:r>
+        <w:rPr>
+          <w:rFonts w:cstheme="minorHAnsi"/>
+          <w:b/>
+          <w:bCs/>
+        </w:rPr>
+        <w:t xml:space="preserve"> 1. Quick refresher: Micro-partitions in Snowflake</w:t>
+      </w:r>
+    </w:p>
+    <w:p>
+      <w:pPr>
+        <w:numPr>
+          <w:ilvl w:val="0"/>
+          <w:numId w:val="48"/>
+        </w:numPr>
+        <w:rPr>
+          <w:rFonts w:cstheme="minorHAnsi"/>
+        </w:rPr>
+      </w:pPr>
+      <w:r>
+        <w:rPr>
+          <w:rFonts w:cstheme="minorHAnsi"/>
+        </w:rPr>
+        <w:t xml:space="preserve">All Snowflake tables are stored in </w:t>
+      </w:r>
+      <w:r>
+        <w:rPr>
+          <w:rFonts w:cstheme="minorHAnsi"/>
+          <w:b/>
+          <w:bCs/>
+        </w:rPr>
+        <w:t>immutable micro-partitions</w:t>
+      </w:r>
+      <w:r>
+        <w:rPr>
+          <w:rFonts w:cstheme="minorHAnsi"/>
+        </w:rPr>
+        <w:t xml:space="preserve"> (~16 MB each).</w:t>
+      </w:r>
+    </w:p>
+    <w:p>
+      <w:pPr>
+        <w:numPr>
+          <w:ilvl w:val="0"/>
+          <w:numId w:val="48"/>
+        </w:numPr>
+        <w:rPr>
+          <w:rFonts w:cstheme="minorHAnsi"/>
+        </w:rPr>
+      </w:pPr>
+      <w:r>
+        <w:rPr>
+          <w:rFonts w:cstheme="minorHAnsi"/>
+        </w:rPr>
+        <w:t>A micro-partition contains:</w:t>
+      </w:r>
+    </w:p>
+    <w:p>
+      <w:pPr>
+        <w:numPr>
+          <w:ilvl w:val="1"/>
+          <w:numId w:val="48"/>
+        </w:numPr>
+        <w:rPr>
+          <w:rFonts w:cstheme="minorHAnsi"/>
+        </w:rPr>
+      </w:pPr>
+      <w:r>
+        <w:rPr>
+          <w:rFonts w:cstheme="minorHAnsi"/>
+        </w:rPr>
+        <w:t>Columnar data (compressed, optimized for queries)</w:t>
+      </w:r>
+    </w:p>
+    <w:p>
+      <w:pPr>
+        <w:numPr>
+          <w:ilvl w:val="1"/>
+          <w:numId w:val="48"/>
+        </w:numPr>
+        <w:rPr>
+          <w:rFonts w:cstheme="minorHAnsi"/>
+        </w:rPr>
+      </w:pPr>
+      <w:r>
+        <w:rPr>
+          <w:rFonts w:cstheme="minorHAnsi"/>
+        </w:rPr>
+        <w:t>Metadata (min/max values, NULL counts, bloom filters)</w:t>
+      </w:r>
+    </w:p>
+    <w:p>
+      <w:pPr>
+        <w:numPr>
+          <w:ilvl w:val="0"/>
+          <w:numId w:val="48"/>
+        </w:numPr>
+        <w:rPr>
+          <w:rFonts w:cstheme="minorHAnsi"/>
+        </w:rPr>
+      </w:pPr>
+      <w:r>
+        <w:rPr>
+          <w:rFonts w:cstheme="minorHAnsi"/>
+        </w:rPr>
+        <w:t>Tables are just a collection of these partitions + metadata.</w:t>
+      </w:r>
+    </w:p>
+    <w:p>
+      <w:pPr>
+        <w:rPr>
+          <w:rFonts w:cstheme="minorHAnsi"/>
+        </w:rPr>
+      </w:pPr>
+      <w:r>
+        <w:rPr>
+          <w:rFonts w:ascii="Segoe UI Emoji" w:hAnsi="Segoe UI Emoji" w:cs="Segoe UI Emoji"/>
+        </w:rPr>
+        <w:t>👉</w:t>
+      </w:r>
+      <w:r>
+        <w:rPr>
+          <w:rFonts w:cstheme="minorHAnsi"/>
+        </w:rPr>
+        <w:t xml:space="preserve"> This design is why Snowflake is </w:t>
+      </w:r>
+      <w:r>
+        <w:rPr>
+          <w:rFonts w:cstheme="minorHAnsi"/>
+          <w:b/>
+          <w:bCs/>
+        </w:rPr>
+        <w:t>zero-copy</w:t>
+      </w:r>
+      <w:r>
+        <w:rPr>
+          <w:rFonts w:cstheme="minorHAnsi"/>
+        </w:rPr>
+        <w:t xml:space="preserve"> and very efficient.</w:t>
+      </w:r>
+    </w:p>
+    <w:p>
+      <w:pPr>
+        <w:rPr>
+          <w:rFonts w:cstheme="minorHAnsi"/>
+        </w:rPr>
+      </w:pPr>
+      <w:r>
+        <w:rPr>
+          <w:rFonts w:cstheme="minorHAnsi"/>
+        </w:rPr>
+        <w:pict w14:anchorId="0AD369F2">
+          <v:rect id="_x0000_i1746" style="width:0;height:1.5pt" o:hralign="center" o:hrstd="t" o:hr="t" fillcolor="#a0a0a0" stroked="f"/>
+        </w:pict>
+      </w:r>
+    </w:p>
+    <w:p>
+      <w:pPr>
+        <w:rPr>
+          <w:rFonts w:cstheme="minorHAnsi"/>
+          <w:b/>
+          <w:bCs/>
+        </w:rPr>
+      </w:pPr>
+      <w:r>
+        <w:rPr>
+          <w:rFonts w:ascii="Segoe UI Emoji" w:hAnsi="Segoe UI Emoji" w:cs="Segoe UI Emoji"/>
+          <w:b/>
+          <w:bCs/>
+        </w:rPr>
+        <w:t>🔎</w:t>
+      </w:r>
+      <w:r>
+        <w:rPr>
+          <w:rFonts w:cstheme="minorHAnsi"/>
+          <w:b/>
+          <w:bCs/>
+        </w:rPr>
+        <w:t xml:space="preserve"> 2. What happens when Schema Evolution adds new columns?</w:t>
+      </w:r>
+    </w:p>
+    <w:p>
+      <w:pPr>
+        <w:rPr>
+          <w:rFonts w:cstheme="minorHAnsi"/>
+        </w:rPr>
+      </w:pPr>
+      <w:r>
+        <w:rPr>
+          <w:rFonts w:cstheme="minorHAnsi"/>
+        </w:rPr>
+        <w:t>When you run schema evolution (ALTER TABLE … SET ENABLE_SCHEMA_EVOLUTION = TRUE and load a file with new columns):</w:t>
+      </w:r>
+    </w:p>
+    <w:p>
+      <w:pPr>
+        <w:numPr>
+          <w:ilvl w:val="0"/>
+          <w:numId w:val="49"/>
+        </w:numPr>
+        <w:rPr>
+          <w:rFonts w:cstheme="minorHAnsi"/>
+        </w:rPr>
+      </w:pPr>
+      <w:r>
+        <w:rPr>
+          <w:rFonts w:cstheme="minorHAnsi"/>
+        </w:rPr>
+        <w:t xml:space="preserve">Snowflake </w:t>
+      </w:r>
+      <w:r>
+        <w:rPr>
+          <w:rFonts w:cstheme="minorHAnsi"/>
+          <w:b/>
+          <w:bCs/>
+        </w:rPr>
+        <w:t>does not rewrite old micro-partitions</w:t>
+      </w:r>
+      <w:r>
+        <w:rPr>
+          <w:rFonts w:cstheme="minorHAnsi"/>
+        </w:rPr>
+        <w:t>.</w:t>
+      </w:r>
+    </w:p>
+    <w:p>
+      <w:pPr>
+        <w:numPr>
+          <w:ilvl w:val="0"/>
+          <w:numId w:val="49"/>
+        </w:numPr>
+        <w:rPr>
+          <w:rFonts w:cstheme="minorHAnsi"/>
+        </w:rPr>
+      </w:pPr>
+      <w:r>
+        <w:rPr>
+          <w:rFonts w:cstheme="minorHAnsi"/>
+        </w:rPr>
+        <w:t xml:space="preserve">Instead, it updates the </w:t>
+      </w:r>
+      <w:r>
+        <w:rPr>
+          <w:rFonts w:cstheme="minorHAnsi"/>
+          <w:b/>
+          <w:bCs/>
+        </w:rPr>
+        <w:t>table metadata</w:t>
+      </w:r>
+      <w:r>
+        <w:rPr>
+          <w:rFonts w:cstheme="minorHAnsi"/>
+        </w:rPr>
+        <w:t>:</w:t>
+      </w:r>
+    </w:p>
+    <w:p>
+      <w:pPr>
+        <w:numPr>
+          <w:ilvl w:val="1"/>
+          <w:numId w:val="49"/>
+        </w:numPr>
+        <w:rPr>
+          <w:rFonts w:cstheme="minorHAnsi"/>
+        </w:rPr>
+      </w:pPr>
+      <w:r>
+        <w:rPr>
+          <w:rFonts w:cstheme="minorHAnsi"/>
+        </w:rPr>
+        <w:t>Adds a new column definition (default type = VARCHAR).</w:t>
+      </w:r>
+    </w:p>
+    <w:p>
+      <w:pPr>
+        <w:numPr>
+          <w:ilvl w:val="1"/>
+          <w:numId w:val="49"/>
+        </w:numPr>
+        <w:rPr>
+          <w:rFonts w:cstheme="minorHAnsi"/>
+        </w:rPr>
+      </w:pPr>
+      <w:r>
+        <w:rPr>
+          <w:rFonts w:cstheme="minorHAnsi"/>
+        </w:rPr>
+        <w:t xml:space="preserve">Old micro-partitions simply </w:t>
+      </w:r>
+      <w:r>
+        <w:rPr>
+          <w:rFonts w:cstheme="minorHAnsi"/>
+          <w:b/>
+          <w:bCs/>
+        </w:rPr>
+        <w:t>don’t have this column</w:t>
+      </w:r>
+      <w:r>
+        <w:rPr>
+          <w:rFonts w:cstheme="minorHAnsi"/>
+        </w:rPr>
+        <w:t>.</w:t>
+      </w:r>
+    </w:p>
+    <w:p>
+      <w:pPr>
+        <w:rPr>
+          <w:rFonts w:cstheme="minorHAnsi"/>
+        </w:rPr>
+      </w:pPr>
+      <w:r>
+        <w:rPr>
+          <w:rFonts w:ascii="Segoe UI Symbol" w:hAnsi="Segoe UI Symbol" w:cs="Segoe UI Symbol"/>
+        </w:rPr>
+        <w:t>➡</w:t>
+      </w:r>
+      <w:r>
+        <w:rPr>
+          <w:rFonts w:cstheme="minorHAnsi"/>
+        </w:rPr>
+        <w:t xml:space="preserve"> Internally, when a query asks for that column in old partitions:</w:t>
+      </w:r>
+    </w:p>
+    <w:p>
+      <w:pPr>
+        <w:numPr>
+          <w:ilvl w:val="0"/>
+          <w:numId w:val="50"/>
+        </w:numPr>
+        <w:rPr>
+          <w:rFonts w:cstheme="minorHAnsi"/>
+        </w:rPr>
+      </w:pPr>
+      <w:r>
+        <w:rPr>
+          <w:rFonts w:cstheme="minorHAnsi"/>
+        </w:rPr>
+        <w:lastRenderedPageBreak/>
+        <w:t xml:space="preserve">Snowflake injects </w:t>
+      </w:r>
+      <w:r>
+        <w:rPr>
+          <w:rFonts w:cstheme="minorHAnsi"/>
+          <w:b/>
+          <w:bCs/>
+        </w:rPr>
+        <w:t>NULLs on the fly</w:t>
+      </w:r>
+      <w:r>
+        <w:rPr>
+          <w:rFonts w:cstheme="minorHAnsi"/>
+        </w:rPr>
+        <w:t xml:space="preserve"> (since older partitions didn’t store values for that column).</w:t>
+      </w:r>
+    </w:p>
+    <w:p>
+      <w:pPr>
+        <w:numPr>
+          <w:ilvl w:val="0"/>
+          <w:numId w:val="50"/>
+        </w:numPr>
+        <w:rPr>
+          <w:rFonts w:cstheme="minorHAnsi"/>
+        </w:rPr>
+      </w:pPr>
+      <w:r>
+        <w:rPr>
+          <w:rFonts w:cstheme="minorHAnsi"/>
+        </w:rPr>
+        <w:t>New micro-partitions (created after schema change) will store the actual data.</w:t>
+      </w:r>
+    </w:p>
+    <w:p>
+      <w:pPr>
+        <w:rPr>
+          <w:rFonts w:cstheme="minorHAnsi"/>
+        </w:rPr>
+      </w:pPr>
+      <w:r>
+        <w:rPr>
+          <w:rFonts w:cstheme="minorHAnsi"/>
+          <w:b/>
+          <w:bCs/>
+        </w:rPr>
+        <w:t>Example:</w:t>
+      </w:r>
+    </w:p>
+    <w:p>
+      <w:pPr>
+        <w:numPr>
+          <w:ilvl w:val="0"/>
+          <w:numId w:val="51"/>
+        </w:numPr>
+        <w:rPr>
+          <w:rFonts w:cstheme="minorHAnsi"/>
+        </w:rPr>
+      </w:pPr>
+      <w:r>
+        <w:rPr>
+          <w:rFonts w:cstheme="minorHAnsi"/>
+        </w:rPr>
+        <w:t>Load cust_1.csv → 10 columns → partitions contain 10 fields.</w:t>
+      </w:r>
+    </w:p>
+    <w:p>
+      <w:pPr>
+        <w:numPr>
+          <w:ilvl w:val="0"/>
+          <w:numId w:val="51"/>
+        </w:numPr>
+        <w:rPr>
+          <w:rFonts w:cstheme="minorHAnsi"/>
+        </w:rPr>
+      </w:pPr>
+      <w:r>
+        <w:rPr>
+          <w:rFonts w:cstheme="minorHAnsi"/>
+        </w:rPr>
+        <w:t>Load cust_2.csv → adds AGE → new partitions contain 11 fields.</w:t>
+      </w:r>
+    </w:p>
+    <w:p>
+      <w:pPr>
+        <w:numPr>
+          <w:ilvl w:val="0"/>
+          <w:numId w:val="51"/>
+        </w:numPr>
+        <w:rPr>
+          <w:rFonts w:cstheme="minorHAnsi"/>
+        </w:rPr>
+      </w:pPr>
+      <w:r>
+        <w:rPr>
+          <w:rFonts w:cstheme="minorHAnsi"/>
+        </w:rPr>
+        <w:t xml:space="preserve">Query SELECT AGE FROM </w:t>
+      </w:r>
+      <w:proofErr w:type="spellStart"/>
+      <w:r>
+        <w:rPr>
+          <w:rFonts w:cstheme="minorHAnsi"/>
+        </w:rPr>
+        <w:t>customer_data</w:t>
+      </w:r>
+      <w:proofErr w:type="spellEnd"/>
+      <w:r>
+        <w:rPr>
+          <w:rFonts w:cstheme="minorHAnsi"/>
+        </w:rPr>
+        <w:t xml:space="preserve"> →</w:t>
+      </w:r>
+    </w:p>
+    <w:p>
+      <w:pPr>
+        <w:numPr>
+          <w:ilvl w:val="1"/>
+          <w:numId w:val="51"/>
+        </w:numPr>
+        <w:rPr>
+          <w:rFonts w:cstheme="minorHAnsi"/>
+        </w:rPr>
+      </w:pPr>
+      <w:r>
+        <w:rPr>
+          <w:rFonts w:cstheme="minorHAnsi"/>
+        </w:rPr>
+        <w:t>Old partitions return NULL.</w:t>
+      </w:r>
+    </w:p>
+    <w:p>
+      <w:pPr>
+        <w:numPr>
+          <w:ilvl w:val="1"/>
+          <w:numId w:val="51"/>
+        </w:numPr>
+        <w:rPr>
+          <w:rFonts w:cstheme="minorHAnsi"/>
+        </w:rPr>
+      </w:pPr>
+      <w:r>
+        <w:rPr>
+          <w:rFonts w:cstheme="minorHAnsi"/>
+        </w:rPr>
+        <w:t>New partitions return values.</w:t>
+      </w:r>
+    </w:p>
+    <w:p>
+      <w:pPr>
+        <w:rPr>
+          <w:rFonts w:cstheme="minorHAnsi"/>
+        </w:rPr>
+      </w:pPr>
+      <w:r>
+        <w:rPr>
+          <w:rFonts w:ascii="Segoe UI Emoji" w:hAnsi="Segoe UI Emoji" w:cs="Segoe UI Emoji"/>
+        </w:rPr>
+        <w:t>👉</w:t>
+      </w:r>
+      <w:r>
+        <w:rPr>
+          <w:rFonts w:cstheme="minorHAnsi"/>
+        </w:rPr>
+        <w:t xml:space="preserve"> Result: Schema evolution </w:t>
+      </w:r>
+      <w:r>
+        <w:rPr>
+          <w:rFonts w:cstheme="minorHAnsi"/>
+          <w:b/>
+          <w:bCs/>
+        </w:rPr>
+        <w:t>doesn’t rewrite old data</w:t>
+      </w:r>
+      <w:r>
+        <w:rPr>
+          <w:rFonts w:cstheme="minorHAnsi"/>
+        </w:rPr>
+        <w:t xml:space="preserve"> (cost saving!) but makes queries return consistent results.</w:t>
+      </w:r>
+    </w:p>
+    <w:p>
+      <w:pPr>
+        <w:rPr>
+          <w:rFonts w:cstheme="minorHAnsi"/>
+        </w:rPr>
+      </w:pPr>
+      <w:r>
+        <w:rPr>
+          <w:rFonts w:cstheme="minorHAnsi"/>
+        </w:rPr>
+        <w:pict w14:anchorId="6B94239E">
+          <v:rect id="_x0000_i1747" style="width:0;height:1.5pt" o:hralign="center" o:hrstd="t" o:hr="t" fillcolor="#a0a0a0" stroked="f"/>
+        </w:pict>
+      </w:r>
+    </w:p>
+    <w:p>
+      <w:pPr>
+        <w:rPr>
+          <w:rFonts w:cstheme="minorHAnsi"/>
+          <w:b/>
+          <w:bCs/>
+        </w:rPr>
+      </w:pPr>
+      <w:r>
+        <w:rPr>
+          <w:rFonts w:ascii="Segoe UI Emoji" w:hAnsi="Segoe UI Emoji" w:cs="Segoe UI Emoji"/>
+          <w:b/>
+          <w:bCs/>
+        </w:rPr>
+        <w:t>🔎</w:t>
+      </w:r>
+      <w:r>
+        <w:rPr>
+          <w:rFonts w:cstheme="minorHAnsi"/>
+          <w:b/>
+          <w:bCs/>
+        </w:rPr>
+        <w:t xml:space="preserve"> 3. What happens when columns are missing in a new file?</w:t>
+      </w:r>
+    </w:p>
+    <w:p>
+      <w:pPr>
+        <w:numPr>
+          <w:ilvl w:val="0"/>
+          <w:numId w:val="52"/>
+        </w:numPr>
+        <w:rPr>
+          <w:rFonts w:cstheme="minorHAnsi"/>
+        </w:rPr>
+      </w:pPr>
+      <w:r>
+        <w:rPr>
+          <w:rFonts w:cstheme="minorHAnsi"/>
+        </w:rPr>
+        <w:t>Suppose your table has 12 columns, but cust_3.csv only has 9.</w:t>
+      </w:r>
+    </w:p>
+    <w:p>
+      <w:pPr>
+        <w:numPr>
+          <w:ilvl w:val="0"/>
+          <w:numId w:val="52"/>
+        </w:numPr>
+        <w:rPr>
+          <w:rFonts w:cstheme="minorHAnsi"/>
+        </w:rPr>
+      </w:pPr>
+      <w:r>
+        <w:rPr>
+          <w:rFonts w:cstheme="minorHAnsi"/>
+        </w:rPr>
+        <w:t xml:space="preserve">Snowflake creates new partitions where missing columns are filled as </w:t>
+      </w:r>
+      <w:r>
+        <w:rPr>
+          <w:rFonts w:cstheme="minorHAnsi"/>
+          <w:b/>
+          <w:bCs/>
+        </w:rPr>
+        <w:t>NULL</w:t>
+      </w:r>
+      <w:r>
+        <w:rPr>
+          <w:rFonts w:cstheme="minorHAnsi"/>
+        </w:rPr>
+        <w:t xml:space="preserve"> in partition metadata.</w:t>
+      </w:r>
+    </w:p>
+    <w:p>
+      <w:pPr>
+        <w:numPr>
+          <w:ilvl w:val="0"/>
+          <w:numId w:val="52"/>
+        </w:numPr>
+        <w:rPr>
+          <w:rFonts w:cstheme="minorHAnsi"/>
+        </w:rPr>
+      </w:pPr>
+      <w:proofErr w:type="gramStart"/>
+      <w:r>
+        <w:rPr>
+          <w:rFonts w:cstheme="minorHAnsi"/>
+        </w:rPr>
+        <w:t>So</w:t>
+      </w:r>
+      <w:proofErr w:type="gramEnd"/>
+      <w:r>
+        <w:rPr>
+          <w:rFonts w:cstheme="minorHAnsi"/>
+        </w:rPr>
+        <w:t xml:space="preserve"> partitions stay consistent, no errors.</w:t>
+      </w:r>
+    </w:p>
+    <w:p>
+      <w:pPr>
+        <w:rPr>
+          <w:rFonts w:cstheme="minorHAnsi"/>
+        </w:rPr>
+      </w:pPr>
+      <w:r>
+        <w:rPr>
+          <w:rFonts w:cstheme="minorHAnsi"/>
+        </w:rPr>
+        <w:pict w14:anchorId="2D275D86">
+          <v:rect id="_x0000_i1748" style="width:0;height:1.5pt" o:hralign="center" o:hrstd="t" o:hr="t" fillcolor="#a0a0a0" stroked="f"/>
+        </w:pict>
+      </w:r>
+    </w:p>
+    <w:p>
+      <w:pPr>
+        <w:rPr>
+          <w:rFonts w:cstheme="minorHAnsi"/>
+          <w:b/>
+          <w:bCs/>
+        </w:rPr>
+      </w:pPr>
+      <w:r>
+        <w:rPr>
+          <w:rFonts w:ascii="Segoe UI Emoji" w:hAnsi="Segoe UI Emoji" w:cs="Segoe UI Emoji"/>
+          <w:b/>
+          <w:bCs/>
+        </w:rPr>
+        <w:t>🔎</w:t>
+      </w:r>
+      <w:r>
+        <w:rPr>
+          <w:rFonts w:cstheme="minorHAnsi"/>
+          <w:b/>
+          <w:bCs/>
+        </w:rPr>
+        <w:t xml:space="preserve"> 4. Query performance impact</w:t>
+      </w:r>
+    </w:p>
+    <w:p>
+      <w:pPr>
+        <w:rPr>
+          <w:rFonts w:cstheme="minorHAnsi"/>
+        </w:rPr>
+      </w:pPr>
+      <w:r>
+        <w:rPr>
+          <w:rFonts w:cstheme="minorHAnsi"/>
+        </w:rPr>
+        <w:t xml:space="preserve">Because schema evolution creates </w:t>
+      </w:r>
+      <w:r>
+        <w:rPr>
+          <w:rFonts w:cstheme="minorHAnsi"/>
+          <w:b/>
+          <w:bCs/>
+        </w:rPr>
+        <w:t>wide tables with varying column sets</w:t>
+      </w:r>
+      <w:r>
+        <w:rPr>
+          <w:rFonts w:cstheme="minorHAnsi"/>
+        </w:rPr>
+        <w:t xml:space="preserve"> across partitions:</w:t>
+      </w:r>
+    </w:p>
+    <w:p>
+      <w:pPr>
+        <w:numPr>
+          <w:ilvl w:val="0"/>
+          <w:numId w:val="53"/>
+        </w:numPr>
+        <w:rPr>
+          <w:rFonts w:cstheme="minorHAnsi"/>
+        </w:rPr>
+      </w:pPr>
+      <w:r>
+        <w:rPr>
+          <w:rFonts w:cstheme="minorHAnsi"/>
+        </w:rPr>
+        <w:t xml:space="preserve">If you query </w:t>
+      </w:r>
+      <w:r>
+        <w:rPr>
+          <w:rFonts w:cstheme="minorHAnsi"/>
+          <w:b/>
+          <w:bCs/>
+        </w:rPr>
+        <w:t>new columns</w:t>
+      </w:r>
+      <w:r>
+        <w:rPr>
+          <w:rFonts w:cstheme="minorHAnsi"/>
+        </w:rPr>
+        <w:t xml:space="preserve"> → Snowflake may need to scan only the </w:t>
+      </w:r>
+      <w:r>
+        <w:rPr>
+          <w:rFonts w:cstheme="minorHAnsi"/>
+          <w:b/>
+          <w:bCs/>
+        </w:rPr>
+        <w:t>newer partitions</w:t>
+      </w:r>
+      <w:r>
+        <w:rPr>
+          <w:rFonts w:cstheme="minorHAnsi"/>
+        </w:rPr>
+        <w:t xml:space="preserve"> (good for pruning).</w:t>
+      </w:r>
+    </w:p>
+    <w:p>
+      <w:pPr>
+        <w:numPr>
+          <w:ilvl w:val="0"/>
+          <w:numId w:val="53"/>
+        </w:numPr>
+        <w:rPr>
+          <w:rFonts w:cstheme="minorHAnsi"/>
+        </w:rPr>
+      </w:pPr>
+      <w:r>
+        <w:rPr>
+          <w:rFonts w:cstheme="minorHAnsi"/>
+        </w:rPr>
+        <w:t xml:space="preserve">If you query </w:t>
+      </w:r>
+      <w:r>
+        <w:rPr>
+          <w:rFonts w:cstheme="minorHAnsi"/>
+          <w:b/>
+          <w:bCs/>
+        </w:rPr>
+        <w:t>old + new columns together</w:t>
+      </w:r>
+      <w:r>
+        <w:rPr>
+          <w:rFonts w:cstheme="minorHAnsi"/>
+        </w:rPr>
+        <w:t xml:space="preserve"> → Snowflake will scan both sets of partitions, injecting NULLs where needed.</w:t>
+      </w:r>
+    </w:p>
+    <w:p>
+      <w:pPr>
+        <w:numPr>
+          <w:ilvl w:val="0"/>
+          <w:numId w:val="53"/>
+        </w:numPr>
+        <w:rPr>
+          <w:rFonts w:cstheme="minorHAnsi"/>
+        </w:rPr>
+      </w:pPr>
+      <w:r>
+        <w:rPr>
+          <w:rFonts w:cstheme="minorHAnsi"/>
+          <w:b/>
+          <w:bCs/>
+        </w:rPr>
+        <w:t>Metadata overhead</w:t>
+      </w:r>
+      <w:r>
+        <w:rPr>
+          <w:rFonts w:cstheme="minorHAnsi"/>
+        </w:rPr>
+        <w:t xml:space="preserve"> slightly grows since Snowflake must track column presence across partitions.</w:t>
+      </w:r>
+    </w:p>
+    <w:p>
+      <w:pPr>
+        <w:rPr>
+          <w:rFonts w:cstheme="minorHAnsi"/>
+        </w:rPr>
+      </w:pPr>
+      <w:r>
+        <w:rPr>
+          <w:rFonts w:cstheme="minorHAnsi"/>
+        </w:rPr>
+        <w:lastRenderedPageBreak/>
+        <w:t xml:space="preserve">But the impact is usually </w:t>
+      </w:r>
+      <w:r>
+        <w:rPr>
+          <w:rFonts w:cstheme="minorHAnsi"/>
+          <w:b/>
+          <w:bCs/>
+        </w:rPr>
+        <w:t>minimal compared to scan volume</w:t>
+      </w:r>
+      <w:r>
+        <w:rPr>
+          <w:rFonts w:cstheme="minorHAnsi"/>
+        </w:rPr>
+        <w:t>.</w:t>
+      </w:r>
+    </w:p>
+    <w:p>
+      <w:pPr>
+        <w:rPr>
+          <w:rFonts w:cstheme="minorHAnsi"/>
+        </w:rPr>
+      </w:pPr>
+      <w:r>
+        <w:rPr>
+          <w:rFonts w:cstheme="minorHAnsi"/>
+        </w:rPr>
+        <w:pict w14:anchorId="5A3B95F3">
+          <v:rect id="_x0000_i1749" style="width:0;height:1.5pt" o:hralign="center" o:hrstd="t" o:hr="t" fillcolor="#a0a0a0" stroked="f"/>
+        </w:pict>
+      </w:r>
+    </w:p>
+    <w:p>
+      <w:pPr>
+        <w:rPr>
+          <w:rFonts w:cstheme="minorHAnsi"/>
+          <w:b/>
+          <w:bCs/>
+        </w:rPr>
+      </w:pPr>
+      <w:r>
+        <w:rPr>
+          <w:rFonts w:ascii="Segoe UI Emoji" w:hAnsi="Segoe UI Emoji" w:cs="Segoe UI Emoji"/>
+          <w:b/>
+          <w:bCs/>
+        </w:rPr>
+        <w:t>🔎</w:t>
+      </w:r>
+      <w:r>
+        <w:rPr>
+          <w:rFonts w:cstheme="minorHAnsi"/>
+          <w:b/>
+          <w:bCs/>
+        </w:rPr>
+        <w:t xml:space="preserve"> 5. Does Schema Evolution fragment partitions?</w:t>
+      </w:r>
+    </w:p>
+    <w:p>
+      <w:pPr>
+        <w:numPr>
+          <w:ilvl w:val="0"/>
+          <w:numId w:val="54"/>
+        </w:numPr>
+        <w:rPr>
+          <w:rFonts w:cstheme="minorHAnsi"/>
+        </w:rPr>
+      </w:pPr>
+      <w:r>
+        <w:rPr>
+          <w:rFonts w:cstheme="minorHAnsi"/>
+        </w:rPr>
+        <w:t>No, partitions remain intact and immutable.</w:t>
+      </w:r>
+    </w:p>
+    <w:p>
+      <w:pPr>
+        <w:numPr>
+          <w:ilvl w:val="0"/>
+          <w:numId w:val="54"/>
+        </w:numPr>
+        <w:rPr>
+          <w:rFonts w:cstheme="minorHAnsi"/>
+        </w:rPr>
+      </w:pPr>
+      <w:r>
+        <w:rPr>
+          <w:rFonts w:cstheme="minorHAnsi"/>
+        </w:rPr>
+        <w:t xml:space="preserve">Adding columns just means </w:t>
+      </w:r>
+      <w:r>
+        <w:rPr>
+          <w:rFonts w:cstheme="minorHAnsi"/>
+          <w:b/>
+          <w:bCs/>
+        </w:rPr>
+        <w:t>new partitions have a slightly different schema version</w:t>
+      </w:r>
+      <w:r>
+        <w:rPr>
+          <w:rFonts w:cstheme="minorHAnsi"/>
+        </w:rPr>
+        <w:t>.</w:t>
+      </w:r>
+    </w:p>
+    <w:p>
+      <w:pPr>
+        <w:numPr>
+          <w:ilvl w:val="0"/>
+          <w:numId w:val="54"/>
+        </w:numPr>
+        <w:rPr>
+          <w:rFonts w:cstheme="minorHAnsi"/>
+        </w:rPr>
+      </w:pPr>
+      <w:r>
+        <w:rPr>
+          <w:rFonts w:cstheme="minorHAnsi"/>
+        </w:rPr>
+        <w:t>Internally, Snowflake uses metadata to reconcile these differences.</w:t>
+      </w:r>
+    </w:p>
+    <w:p>
+      <w:pPr>
+        <w:rPr>
+          <w:rFonts w:cstheme="minorHAnsi"/>
+        </w:rPr>
+      </w:pPr>
+      <w:r>
+        <w:rPr>
+          <w:rFonts w:ascii="Segoe UI Emoji" w:hAnsi="Segoe UI Emoji" w:cs="Segoe UI Emoji"/>
+        </w:rPr>
+        <w:t>👉</w:t>
+      </w:r>
+      <w:r>
+        <w:rPr>
+          <w:rFonts w:cstheme="minorHAnsi"/>
+        </w:rPr>
+        <w:t xml:space="preserve"> The table might internally look like this:</w:t>
+      </w:r>
+    </w:p>
+    <w:tbl>
+      <w:tblPr>
+        <w:tblW w:w="0" w:type="auto"/>
+        <w:tblCellSpacing w:w="15" w:type="dxa"/>
+        <w:tblInd w:w="740" w:type="dxa"/>
+        <w:tblCellMar>
+          <w:top w:w="15" w:type="dxa"/>
+          <w:left w:w="15" w:type="dxa"/>
+          <w:bottom w:w="15" w:type="dxa"/>
+          <w:right w:w="15" w:type="dxa"/>
+        </w:tblCellMar>
+        <w:tblLook w:val="04A0" w:firstRow="1" w:lastRow="0" w:firstColumn="1" w:lastColumn="0" w:noHBand="0" w:noVBand="1"/>
+      </w:tblPr>
+      <w:tblGrid>
+        <w:gridCol w:w="941"/>
+        <w:gridCol w:w="5514"/>
+      </w:tblGrid>
+      <w:tr>
+        <w:trPr>
+          <w:tblHeader/>
+          <w:tblCellSpacing w:w="15" w:type="dxa"/>
+        </w:trPr>
+        <w:tc>
+          <w:tcPr>
+            <w:tcW w:w="0" w:type="auto"/>
+            <w:vAlign w:val="center"/>
+            <w:hideMark/>
+          </w:tcPr>
+          <w:p>
+            <w:pPr>
+              <w:rPr>
+                <w:rFonts w:cstheme="minorHAnsi"/>
+                <w:b/>
+                <w:bCs/>
+              </w:rPr>
+            </w:pPr>
+            <w:r>
+              <w:rPr>
+                <w:rFonts w:cstheme="minorHAnsi"/>
+                <w:b/>
+                <w:bCs/>
+              </w:rPr>
+              <w:t>Partition</w:t>
+            </w:r>
+          </w:p>
+        </w:tc>
+        <w:tc>
+          <w:tcPr>
+            <w:tcW w:w="0" w:type="auto"/>
+            <w:vAlign w:val="center"/>
+            <w:hideMark/>
+          </w:tcPr>
+          <w:p>
+            <w:pPr>
+              <w:rPr>
+                <w:rFonts w:cstheme="minorHAnsi"/>
+                <w:b/>
+                <w:bCs/>
+              </w:rPr>
+            </w:pPr>
+            <w:r>
+              <w:rPr>
+                <w:rFonts w:cstheme="minorHAnsi"/>
+                <w:b/>
+                <w:bCs/>
+              </w:rPr>
+              <w:t>Columns Stored</w:t>
+            </w:r>
+          </w:p>
+        </w:tc>
+      </w:tr>
+      <w:tr>
+        <w:trPr>
+          <w:tblCellSpacing w:w="15" w:type="dxa"/>
+        </w:trPr>
+        <w:tc>
+          <w:tcPr>
+            <w:tcW w:w="0" w:type="auto"/>
+            <w:vAlign w:val="center"/>
+            <w:hideMark/>
+          </w:tcPr>
+          <w:p>
+            <w:pPr>
+              <w:rPr>
+                <w:rFonts w:cstheme="minorHAnsi"/>
+              </w:rPr>
+            </w:pPr>
+            <w:r>
+              <w:rPr>
+                <w:rFonts w:cstheme="minorHAnsi"/>
+              </w:rPr>
+              <w:t>P1</w:t>
+            </w:r>
+          </w:p>
+        </w:tc>
+        <w:tc>
+          <w:tcPr>
+            <w:tcW w:w="0" w:type="auto"/>
+            <w:vAlign w:val="center"/>
+            <w:hideMark/>
+          </w:tcPr>
+          <w:p>
+            <w:pPr>
+              <w:rPr>
+                <w:rFonts w:cstheme="minorHAnsi"/>
+              </w:rPr>
+            </w:pPr>
+            <w:r>
+              <w:rPr>
+                <w:rFonts w:cstheme="minorHAnsi"/>
+              </w:rPr>
+              <w:t>CUST_ID, BALANCE, PURCHASES, …, DATE_OF_TXN</w:t>
+            </w:r>
+          </w:p>
+        </w:tc>
+      </w:tr>
+      <w:tr>
+        <w:trPr>
+          <w:tblCellSpacing w:w="15" w:type="dxa"/>
+        </w:trPr>
+        <w:tc>
+          <w:tcPr>
+            <w:tcW w:w="0" w:type="auto"/>
+            <w:vAlign w:val="center"/>
+            <w:hideMark/>
+          </w:tcPr>
+          <w:p>
+            <w:pPr>
+              <w:rPr>
+                <w:rFonts w:cstheme="minorHAnsi"/>
+              </w:rPr>
+            </w:pPr>
+            <w:r>
+              <w:rPr>
+                <w:rFonts w:cstheme="minorHAnsi"/>
+              </w:rPr>
+              <w:t>P2</w:t>
+            </w:r>
+          </w:p>
+        </w:tc>
+        <w:tc>
+          <w:tcPr>
+            <w:tcW w:w="0" w:type="auto"/>
+            <w:vAlign w:val="center"/>
+            <w:hideMark/>
+          </w:tcPr>
+          <w:p>
+            <w:pPr>
+              <w:rPr>
+                <w:rFonts w:cstheme="minorHAnsi"/>
+              </w:rPr>
+            </w:pPr>
+            <w:r>
+              <w:rPr>
+                <w:rFonts w:cstheme="minorHAnsi"/>
+              </w:rPr>
+              <w:t>CUST_ID, BALANCE, PURCHASES, …, DATE_OF_TXN, AGE</w:t>
+            </w:r>
+          </w:p>
+        </w:tc>
+      </w:tr>
+      <w:tr>
+        <w:trPr>
+          <w:tblCellSpacing w:w="15" w:type="dxa"/>
+        </w:trPr>
+        <w:tc>
+          <w:tcPr>
+            <w:tcW w:w="0" w:type="auto"/>
+            <w:vAlign w:val="center"/>
+            <w:hideMark/>
+          </w:tcPr>
+          <w:p>
+            <w:pPr>
+              <w:rPr>
+                <w:rFonts w:cstheme="minorHAnsi"/>
+              </w:rPr>
+            </w:pPr>
+            <w:r>
+              <w:rPr>
+                <w:rFonts w:cstheme="minorHAnsi"/>
+              </w:rPr>
+              <w:t>P3</w:t>
+            </w:r>
+          </w:p>
+        </w:tc>
+        <w:tc>
+          <w:tcPr>
+            <w:tcW w:w="0" w:type="auto"/>
+            <w:vAlign w:val="center"/>
+            <w:hideMark/>
+          </w:tcPr>
+          <w:p>
+            <w:pPr>
+              <w:rPr>
+                <w:rFonts w:cstheme="minorHAnsi"/>
+              </w:rPr>
+            </w:pPr>
+            <w:r>
+              <w:rPr>
+                <w:rFonts w:cstheme="minorHAnsi"/>
+              </w:rPr>
+              <w:t>CUST_ID, BALANCE, PURCHASES, CITY, AGE</w:t>
+            </w:r>
+          </w:p>
+        </w:tc>
+      </w:tr>
+    </w:tbl>
+    <w:p>
+      <w:pPr>
+        <w:rPr>
+          <w:rFonts w:cstheme="minorHAnsi"/>
+        </w:rPr>
+      </w:pPr>
+      <w:r>
+        <w:rPr>
+          <w:rFonts w:cstheme="minorHAnsi"/>
+        </w:rPr>
+        <w:t>When queried:</w:t>
+      </w:r>
+    </w:p>
+    <w:p>
+      <w:pPr>
+        <w:numPr>
+          <w:ilvl w:val="0"/>
+          <w:numId w:val="55"/>
+        </w:numPr>
+        <w:rPr>
+          <w:rFonts w:cstheme="minorHAnsi"/>
+        </w:rPr>
+      </w:pPr>
+      <w:r>
+        <w:rPr>
+          <w:rFonts w:cstheme="minorHAnsi"/>
+        </w:rPr>
+        <w:t>Snowflake aligns partitions at runtime so you always see a “flat” table.</w:t>
+      </w:r>
+    </w:p>
+    <w:p>
+      <w:pPr>
+        <w:rPr>
+          <w:rFonts w:cstheme="minorHAnsi"/>
+        </w:rPr>
+      </w:pPr>
+      <w:r>
+        <w:rPr>
+          <w:rFonts w:cstheme="minorHAnsi"/>
+        </w:rPr>
+        <w:pict w14:anchorId="3AF474ED">
+          <v:rect id="_x0000_i1750" style="width:0;height:1.5pt" o:hralign="center" o:hrstd="t" o:hr="t" fillcolor="#a0a0a0" stroked="f"/>
+        </w:pict>
+      </w:r>
+    </w:p>
+    <w:p>
+      <w:pPr>
+        <w:rPr>
+          <w:rFonts w:cstheme="minorHAnsi"/>
+          <w:b/>
+          <w:bCs/>
+        </w:rPr>
+      </w:pPr>
+      <w:r>
+        <w:rPr>
+          <w:rFonts w:ascii="Segoe UI Emoji" w:hAnsi="Segoe UI Emoji" w:cs="Segoe UI Emoji"/>
+          <w:b/>
+          <w:bCs/>
+        </w:rPr>
+        <w:t>🔎</w:t>
+      </w:r>
+      <w:r>
+        <w:rPr>
+          <w:rFonts w:cstheme="minorHAnsi"/>
+          <w:b/>
+          <w:bCs/>
+        </w:rPr>
+        <w:t xml:space="preserve"> 6. Impact on clustering &amp; pruning</w:t>
+      </w:r>
+    </w:p>
+    <w:p>
+      <w:pPr>
+        <w:numPr>
+          <w:ilvl w:val="0"/>
+          <w:numId w:val="56"/>
+        </w:numPr>
+        <w:rPr>
+          <w:rFonts w:cstheme="minorHAnsi"/>
+        </w:rPr>
+      </w:pPr>
+      <w:r>
+        <w:rPr>
+          <w:rFonts w:cstheme="minorHAnsi"/>
+        </w:rPr>
+        <w:t>Since Snowflake aligns columns via metadata:</w:t>
+      </w:r>
+    </w:p>
+    <w:p>
+      <w:pPr>
+        <w:numPr>
+          <w:ilvl w:val="1"/>
+          <w:numId w:val="56"/>
+        </w:numPr>
+        <w:rPr>
+          <w:rFonts w:cstheme="minorHAnsi"/>
+        </w:rPr>
+      </w:pPr>
+      <w:r>
+        <w:rPr>
+          <w:rFonts w:cstheme="minorHAnsi"/>
+          <w:b/>
+          <w:bCs/>
+        </w:rPr>
+        <w:t>Pruning (skipping partitions)</w:t>
+      </w:r>
+      <w:r>
+        <w:rPr>
+          <w:rFonts w:cstheme="minorHAnsi"/>
+        </w:rPr>
+        <w:t xml:space="preserve"> still works for old columns.</w:t>
+      </w:r>
+    </w:p>
+    <w:p>
+      <w:pPr>
+        <w:numPr>
+          <w:ilvl w:val="1"/>
+          <w:numId w:val="56"/>
+        </w:numPr>
+        <w:rPr>
+          <w:rFonts w:cstheme="minorHAnsi"/>
+        </w:rPr>
+      </w:pPr>
+      <w:r>
+        <w:rPr>
+          <w:rFonts w:cstheme="minorHAnsi"/>
+        </w:rPr>
+        <w:t xml:space="preserve">For </w:t>
+      </w:r>
+      <w:r>
+        <w:rPr>
+          <w:rFonts w:cstheme="minorHAnsi"/>
+          <w:b/>
+          <w:bCs/>
+        </w:rPr>
+        <w:t>newly added columns</w:t>
+      </w:r>
+      <w:r>
+        <w:rPr>
+          <w:rFonts w:cstheme="minorHAnsi"/>
+        </w:rPr>
+        <w:t xml:space="preserve">, pruning only applies to </w:t>
+      </w:r>
+      <w:r>
+        <w:rPr>
+          <w:rFonts w:cstheme="minorHAnsi"/>
+          <w:b/>
+          <w:bCs/>
+        </w:rPr>
+        <w:t>new partitions</w:t>
+      </w:r>
+      <w:r>
+        <w:rPr>
+          <w:rFonts w:cstheme="minorHAnsi"/>
+        </w:rPr>
+        <w:t xml:space="preserve"> (old ones don’t have min/max stats since values are NULL).</w:t>
+      </w:r>
+    </w:p>
+    <w:p>
+      <w:pPr>
+        <w:numPr>
+          <w:ilvl w:val="0"/>
+          <w:numId w:val="56"/>
+        </w:numPr>
+        <w:rPr>
+          <w:rFonts w:cstheme="minorHAnsi"/>
+        </w:rPr>
+      </w:pPr>
+      <w:r>
+        <w:rPr>
+          <w:rFonts w:cstheme="minorHAnsi"/>
+        </w:rPr>
+        <w:t>If queries rely heavily on new columns, pruning efficiency increases only as more data with those columns arrives.</w:t>
+      </w:r>
+    </w:p>
+    <w:p>
+      <w:pPr>
+        <w:rPr>
+          <w:rFonts w:cstheme="minorHAnsi"/>
+        </w:rPr>
+      </w:pPr>
+      <w:r>
+        <w:rPr>
+          <w:rFonts w:cstheme="minorHAnsi"/>
+        </w:rPr>
+        <w:pict w14:anchorId="4F368648">
+          <v:rect id="_x0000_i1751" style="width:0;height:1.5pt" o:hralign="center" o:hrstd="t" o:hr="t" fillcolor="#a0a0a0" stroked="f"/>
+        </w:pict>
+      </w:r>
+    </w:p>
+    <w:p>
+      <w:pPr>
+        <w:rPr>
+          <w:rFonts w:cstheme="minorHAnsi"/>
+          <w:b/>
+          <w:bCs/>
+        </w:rPr>
+      </w:pPr>
+      <w:r>
+        <w:rPr>
+          <w:rFonts w:ascii="Segoe UI Emoji" w:hAnsi="Segoe UI Emoji" w:cs="Segoe UI Emoji"/>
+          <w:b/>
+          <w:bCs/>
+        </w:rPr>
+        <w:t>🔎</w:t>
+      </w:r>
+      <w:r>
+        <w:rPr>
+          <w:rFonts w:cstheme="minorHAnsi"/>
+          <w:b/>
+          <w:bCs/>
+        </w:rPr>
+        <w:t xml:space="preserve"> 7. Cost implications (internals)</w:t>
+      </w:r>
+    </w:p>
+    <w:p>
+      <w:pPr>
+        <w:numPr>
+          <w:ilvl w:val="0"/>
+          <w:numId w:val="57"/>
+        </w:numPr>
+        <w:rPr>
+          <w:rFonts w:cstheme="minorHAnsi"/>
+        </w:rPr>
+      </w:pPr>
+      <w:r>
+        <w:rPr>
+          <w:rFonts w:cstheme="minorHAnsi"/>
+          <w:b/>
+          <w:bCs/>
+        </w:rPr>
+        <w:t>No backfill cost</w:t>
+      </w:r>
+      <w:r>
+        <w:rPr>
+          <w:rFonts w:cstheme="minorHAnsi"/>
+        </w:rPr>
+        <w:t xml:space="preserve"> → old partitions untouched.</w:t>
+      </w:r>
+    </w:p>
+    <w:p>
+      <w:pPr>
+        <w:numPr>
+          <w:ilvl w:val="0"/>
+          <w:numId w:val="57"/>
+        </w:numPr>
+        <w:rPr>
+          <w:rFonts w:cstheme="minorHAnsi"/>
+        </w:rPr>
+      </w:pPr>
+      <w:r>
+        <w:rPr>
+          <w:rFonts w:cstheme="minorHAnsi"/>
+          <w:b/>
+          <w:bCs/>
+        </w:rPr>
+        <w:lastRenderedPageBreak/>
+        <w:t>Query cost</w:t>
+      </w:r>
+      <w:r>
+        <w:rPr>
+          <w:rFonts w:cstheme="minorHAnsi"/>
+        </w:rPr>
+        <w:t xml:space="preserve"> may rise slightly:</w:t>
+      </w:r>
+    </w:p>
+    <w:p>
+      <w:pPr>
+        <w:numPr>
+          <w:ilvl w:val="1"/>
+          <w:numId w:val="57"/>
+        </w:numPr>
+        <w:rPr>
+          <w:rFonts w:cstheme="minorHAnsi"/>
+        </w:rPr>
+      </w:pPr>
+      <w:r>
+        <w:rPr>
+          <w:rFonts w:cstheme="minorHAnsi"/>
+        </w:rPr>
+        <w:t>Because Snowflake must merge metadata from partitions with different schemas.</w:t>
+      </w:r>
+    </w:p>
+    <w:p>
+      <w:pPr>
+        <w:numPr>
+          <w:ilvl w:val="1"/>
+          <w:numId w:val="57"/>
+        </w:numPr>
+        <w:rPr>
+          <w:rFonts w:cstheme="minorHAnsi"/>
+        </w:rPr>
+      </w:pPr>
+      <w:r>
+        <w:rPr>
+          <w:rFonts w:cstheme="minorHAnsi"/>
+        </w:rPr>
+        <w:t>Wide evolving tables → scanning extra columns increases cost if analysts use SELECT *.</w:t>
+      </w:r>
+    </w:p>
+    <w:p>
+      <w:pPr>
+        <w:numPr>
+          <w:ilvl w:val="0"/>
+          <w:numId w:val="57"/>
+        </w:numPr>
+        <w:rPr>
+          <w:rFonts w:cstheme="minorHAnsi"/>
+        </w:rPr>
+      </w:pPr>
+      <w:r>
+        <w:rPr>
+          <w:rFonts w:cstheme="minorHAnsi"/>
+        </w:rPr>
+        <w:t xml:space="preserve">Still, the </w:t>
+      </w:r>
+      <w:proofErr w:type="spellStart"/>
+      <w:r>
+        <w:rPr>
+          <w:rFonts w:cstheme="minorHAnsi"/>
+        </w:rPr>
+        <w:t>tradeoff</w:t>
+      </w:r>
+      <w:proofErr w:type="spellEnd"/>
+      <w:r>
+        <w:rPr>
+          <w:rFonts w:cstheme="minorHAnsi"/>
+        </w:rPr>
+        <w:t xml:space="preserve"> is far cheaper than rewriting history.</w:t>
+      </w:r>
+    </w:p>
+    <w:p>
+      <w:pPr>
+        <w:rPr>
+          <w:rFonts w:cstheme="minorHAnsi"/>
+        </w:rPr>
+      </w:pPr>
+      <w:r>
+        <w:rPr>
+          <w:rFonts w:cstheme="minorHAnsi"/>
+        </w:rPr>
+        <w:pict w14:anchorId="79CA5E5B">
+          <v:rect id="_x0000_i1752" style="width:0;height:1.5pt" o:hralign="center" o:hrstd="t" o:hr="t" fillcolor="#a0a0a0" stroked="f"/>
+        </w:pict>
+      </w:r>
+    </w:p>
+    <w:p>
+      <w:pPr>
+        <w:rPr>
+          <w:rFonts w:cstheme="minorHAnsi"/>
+          <w:b/>
+          <w:bCs/>
+        </w:rPr>
+      </w:pPr>
+      <w:r>
+        <w:rPr>
+          <w:rFonts w:ascii="Segoe UI Emoji" w:hAnsi="Segoe UI Emoji" w:cs="Segoe UI Emoji"/>
+          <w:b/>
+          <w:bCs/>
+        </w:rPr>
+        <w:t>✅</w:t>
+      </w:r>
+      <w:r>
+        <w:rPr>
+          <w:rFonts w:cstheme="minorHAnsi"/>
+          <w:b/>
+          <w:bCs/>
+        </w:rPr>
+        <w:t xml:space="preserve"> Summary</w:t>
+      </w:r>
+    </w:p>
+    <w:p>
+      <w:pPr>
+        <w:numPr>
+          <w:ilvl w:val="0"/>
+          <w:numId w:val="58"/>
+        </w:numPr>
+        <w:rPr>
+          <w:rFonts w:cstheme="minorHAnsi"/>
+        </w:rPr>
+      </w:pPr>
+      <w:r>
+        <w:rPr>
+          <w:rFonts w:cstheme="minorHAnsi"/>
+        </w:rPr>
+        <w:t xml:space="preserve">Schema evolution in Snowflake is </w:t>
+      </w:r>
+      <w:r>
+        <w:rPr>
+          <w:rFonts w:cstheme="minorHAnsi"/>
+          <w:b/>
+          <w:bCs/>
+        </w:rPr>
+        <w:t>metadata-driven</w:t>
+      </w:r>
+      <w:r>
+        <w:rPr>
+          <w:rFonts w:cstheme="minorHAnsi"/>
+        </w:rPr>
+        <w:t>, not data rewrite.</w:t>
+      </w:r>
+    </w:p>
+    <w:p>
+      <w:pPr>
+        <w:numPr>
+          <w:ilvl w:val="0"/>
+          <w:numId w:val="58"/>
+        </w:numPr>
+        <w:rPr>
+          <w:rFonts w:cstheme="minorHAnsi"/>
+        </w:rPr>
+      </w:pPr>
+      <w:r>
+        <w:rPr>
+          <w:rFonts w:cstheme="minorHAnsi"/>
+        </w:rPr>
+        <w:t>Old micro-partitions stay intact; missing columns are NULL-filled on read.</w:t>
+      </w:r>
+    </w:p>
+    <w:p>
+      <w:pPr>
+        <w:numPr>
+          <w:ilvl w:val="0"/>
+          <w:numId w:val="58"/>
+        </w:numPr>
+        <w:rPr>
+          <w:rFonts w:cstheme="minorHAnsi"/>
+        </w:rPr>
+      </w:pPr>
+      <w:r>
+        <w:rPr>
+          <w:rFonts w:cstheme="minorHAnsi"/>
+        </w:rPr>
+        <w:t xml:space="preserve">New columns appear only in </w:t>
+      </w:r>
+      <w:r>
+        <w:rPr>
+          <w:rFonts w:cstheme="minorHAnsi"/>
+          <w:b/>
+          <w:bCs/>
+        </w:rPr>
+        <w:t>new partitions</w:t>
+      </w:r>
+      <w:r>
+        <w:rPr>
+          <w:rFonts w:cstheme="minorHAnsi"/>
+        </w:rPr>
+        <w:t xml:space="preserve"> going forward.</w:t>
+      </w:r>
+    </w:p>
+    <w:p>
+      <w:pPr>
+        <w:numPr>
+          <w:ilvl w:val="0"/>
+          <w:numId w:val="58"/>
+        </w:numPr>
+        <w:rPr>
+          <w:rFonts w:cstheme="minorHAnsi"/>
+        </w:rPr>
+      </w:pPr>
+      <w:r>
+        <w:rPr>
+          <w:rFonts w:cstheme="minorHAnsi"/>
+        </w:rPr>
+        <w:t xml:space="preserve">Query performance impact is minimal unless the table grows </w:t>
+      </w:r>
+      <w:r>
+        <w:rPr>
+          <w:rFonts w:cstheme="minorHAnsi"/>
+          <w:i/>
+          <w:iCs/>
+        </w:rPr>
+        <w:t>very wide</w:t>
+      </w:r>
+      <w:r>
+        <w:rPr>
+          <w:rFonts w:cstheme="minorHAnsi"/>
+        </w:rPr>
+        <w:t>.</w:t>
+      </w:r>
+    </w:p>
+    <w:p>
+      <w:pPr>
+        <w:numPr>
+          <w:ilvl w:val="0"/>
+          <w:numId w:val="58"/>
+        </w:numPr>
+        <w:rPr>
+          <w:rFonts w:cstheme="minorHAnsi"/>
+        </w:rPr>
+      </w:pPr>
+      <w:r>
+        <w:rPr>
+          <w:rFonts w:cstheme="minorHAnsi"/>
+        </w:rPr>
+        <w:t>Pruning works as usual, but for new columns it only applies from the moment they’re introduced.</w:t>
+      </w:r>
+    </w:p>
+    <w:p>
+      <w:pPr>
+        <w:rPr>
+          <w:rFonts w:cstheme="minorHAnsi"/>
+        </w:rPr>
+      </w:pPr>
+      <w:r>
+        <w:rPr>
+          <w:rFonts w:cstheme="minorHAnsi"/>
+        </w:rPr>
+        <w:pict w14:anchorId="2006C7C4">
+          <v:rect id="_x0000_i1760" style="width:0;height:1.5pt" o:hralign="center" o:hrstd="t" o:hr="t" fillcolor="#a0a0a0" stroked="f"/>
+        </w:pict>
+      </w:r>
+    </w:p>
+    <w:p>
+      <w:pPr>
+        <w:rPr>
+          <w:rFonts w:cstheme="minorHAnsi"/>
+          <w:b/>
+          <w:bCs/>
+        </w:rPr>
+      </w:pPr>
+      <w:r>
+        <w:rPr>
+          <w:rFonts w:ascii="Segoe UI Emoji" w:hAnsi="Segoe UI Emoji" w:cs="Segoe UI Emoji"/>
+          <w:b/>
+          <w:bCs/>
+        </w:rPr>
+        <w:t>✅</w:t>
+      </w:r>
+      <w:r>
+        <w:rPr>
+          <w:rFonts w:cstheme="minorHAnsi"/>
+          <w:b/>
+          <w:bCs/>
+        </w:rPr>
+        <w:t xml:space="preserve"> </w:t>
+      </w:r>
+      <w:r>
+        <w:rPr>
+          <w:rFonts w:cstheme="minorHAnsi"/>
+          <w:b/>
+          <w:bCs/>
+        </w:rPr>
         <w:t>Impact Analysis on Storage Cost</w:t>
       </w:r>
     </w:p>
@@ -5391,17 +7129,27 @@
     <w:p>
       <w:pPr>
         <w:rPr>
-          <w:rFonts w:cstheme="minorHAnsi"/>
-          <w:b/>
-          <w:bCs/>
-        </w:rPr>
-      </w:pPr>
-      <w:r>
-        <w:rPr>
           <w:rFonts w:ascii="Segoe UI Emoji" w:hAnsi="Segoe UI Emoji" w:cs="Segoe UI Emoji"/>
           <w:b/>
           <w:bCs/>
         </w:rPr>
+      </w:pPr>
+    </w:p>
+    <w:p>
+      <w:pPr>
+        <w:rPr>
+          <w:rFonts w:cstheme="minorHAnsi"/>
+          <w:b/>
+          <w:bCs/>
+        </w:rPr>
+      </w:pPr>
+      <w:r>
+        <w:rPr>
+          <w:rFonts w:ascii="Segoe UI Emoji" w:hAnsi="Segoe UI Emoji" w:cs="Segoe UI Emoji"/>
+          <w:b/>
+          <w:bCs/>
+        </w:rPr>
+        <w:lastRenderedPageBreak/>
         <w:t>🔹</w:t>
       </w:r>
       <w:r>
@@ -5598,7 +7346,6 @@
         <w:rPr>
           <w:rFonts w:ascii="Segoe UI Emoji" w:hAnsi="Segoe UI Emoji" w:cs="Segoe UI Emoji"/>
         </w:rPr>
-        <w:lastRenderedPageBreak/>
         <w:t>👉</w:t>
       </w:r>
       <w:r>
@@ -5996,6 +7743,7 @@
         <w:rPr>
           <w:rFonts w:cstheme="minorHAnsi"/>
         </w:rPr>
+        <w:lastRenderedPageBreak/>
         <w:t>Best practice: always SELECT only the needed columns.</w:t>
       </w:r>
     </w:p>
@@ -6182,7 +7930,6 @@
         <w:rPr>
           <w:rFonts w:cstheme="minorHAnsi"/>
         </w:rPr>
-        <w:lastRenderedPageBreak/>
         <w:pict w14:anchorId="07FE1E20">
           <v:rect id="_x0000_i1571" style="width:0;height:1.5pt" o:hralign="center" o:hrstd="t" o:hr="t" fillcolor="#a0a0a0" stroked="f"/>
         </w:pict>
@@ -6475,17 +8222,36 @@
     <w:p>
       <w:pPr>
         <w:rPr>
-          <w:rFonts w:cstheme="minorHAnsi"/>
-          <w:b/>
-          <w:bCs/>
-        </w:rPr>
-      </w:pPr>
-      <w:r>
-        <w:rPr>
           <w:rFonts w:ascii="Segoe UI Emoji" w:hAnsi="Segoe UI Emoji" w:cs="Segoe UI Emoji"/>
           <w:b/>
           <w:bCs/>
         </w:rPr>
+      </w:pPr>
+    </w:p>
+    <w:p>
+      <w:pPr>
+        <w:rPr>
+          <w:rFonts w:ascii="Segoe UI Emoji" w:hAnsi="Segoe UI Emoji" w:cs="Segoe UI Emoji"/>
+          <w:b/>
+          <w:bCs/>
+        </w:rPr>
+      </w:pPr>
+    </w:p>
+    <w:p>
+      <w:pPr>
+        <w:rPr>
+          <w:rFonts w:cstheme="minorHAnsi"/>
+          <w:b/>
+          <w:bCs/>
+        </w:rPr>
+      </w:pPr>
+      <w:r>
+        <w:rPr>
+          <w:rFonts w:ascii="Segoe UI Emoji" w:hAnsi="Segoe UI Emoji" w:cs="Segoe UI Emoji"/>
+          <w:b/>
+          <w:bCs/>
+        </w:rPr>
+        <w:lastRenderedPageBreak/>
         <w:t>📘</w:t>
       </w:r>
       <w:r>
@@ -6704,7 +8470,6 @@
           <w:b/>
           <w:bCs/>
         </w:rPr>
-        <w:lastRenderedPageBreak/>
         <w:t>🔹</w:t>
       </w:r>
       <w:r>
@@ -6949,17 +8714,36 @@
     <w:p>
       <w:pPr>
         <w:rPr>
-          <w:rFonts w:cstheme="minorHAnsi"/>
-          <w:b/>
-          <w:bCs/>
-        </w:rPr>
-      </w:pPr>
-      <w:r>
-        <w:rPr>
           <w:rFonts w:ascii="Segoe UI Emoji" w:hAnsi="Segoe UI Emoji" w:cs="Segoe UI Emoji"/>
           <w:b/>
           <w:bCs/>
         </w:rPr>
+      </w:pPr>
+    </w:p>
+    <w:p>
+      <w:pPr>
+        <w:rPr>
+          <w:rFonts w:ascii="Segoe UI Emoji" w:hAnsi="Segoe UI Emoji" w:cs="Segoe UI Emoji"/>
+          <w:b/>
+          <w:bCs/>
+        </w:rPr>
+      </w:pPr>
+    </w:p>
+    <w:p>
+      <w:pPr>
+        <w:rPr>
+          <w:rFonts w:cstheme="minorHAnsi"/>
+          <w:b/>
+          <w:bCs/>
+        </w:rPr>
+      </w:pPr>
+      <w:r>
+        <w:rPr>
+          <w:rFonts w:ascii="Segoe UI Emoji" w:hAnsi="Segoe UI Emoji" w:cs="Segoe UI Emoji"/>
+          <w:b/>
+          <w:bCs/>
+        </w:rPr>
+        <w:lastRenderedPageBreak/>
         <w:t>🔹</w:t>
       </w:r>
       <w:r>
@@ -7197,36 +8981,17 @@
     <w:p>
       <w:pPr>
         <w:rPr>
+          <w:rFonts w:cstheme="minorHAnsi"/>
+          <w:b/>
+          <w:bCs/>
+        </w:rPr>
+      </w:pPr>
+      <w:r>
+        <w:rPr>
           <w:rFonts w:ascii="Segoe UI Emoji" w:hAnsi="Segoe UI Emoji" w:cs="Segoe UI Emoji"/>
           <w:b/>
           <w:bCs/>
         </w:rPr>
-      </w:pPr>
-    </w:p>
-    <w:p>
-      <w:pPr>
-        <w:rPr>
-          <w:rFonts w:ascii="Segoe UI Emoji" w:hAnsi="Segoe UI Emoji" w:cs="Segoe UI Emoji"/>
-          <w:b/>
-          <w:bCs/>
-        </w:rPr>
-      </w:pPr>
-    </w:p>
-    <w:p>
-      <w:pPr>
-        <w:rPr>
-          <w:rFonts w:cstheme="minorHAnsi"/>
-          <w:b/>
-          <w:bCs/>
-        </w:rPr>
-      </w:pPr>
-      <w:r>
-        <w:rPr>
-          <w:rFonts w:ascii="Segoe UI Emoji" w:hAnsi="Segoe UI Emoji" w:cs="Segoe UI Emoji"/>
-          <w:b/>
-          <w:bCs/>
-        </w:rPr>
-        <w:lastRenderedPageBreak/>
         <w:t>🔹</w:t>
       </w:r>
       <w:r>
@@ -7450,17 +9215,36 @@
     <w:p>
       <w:pPr>
         <w:rPr>
-          <w:rFonts w:cstheme="minorHAnsi"/>
-          <w:b/>
-          <w:bCs/>
-        </w:rPr>
-      </w:pPr>
-      <w:r>
-        <w:rPr>
           <w:rFonts w:ascii="Segoe UI Emoji" w:hAnsi="Segoe UI Emoji" w:cs="Segoe UI Emoji"/>
           <w:b/>
           <w:bCs/>
         </w:rPr>
+      </w:pPr>
+    </w:p>
+    <w:p>
+      <w:pPr>
+        <w:rPr>
+          <w:rFonts w:ascii="Segoe UI Emoji" w:hAnsi="Segoe UI Emoji" w:cs="Segoe UI Emoji"/>
+          <w:b/>
+          <w:bCs/>
+        </w:rPr>
+      </w:pPr>
+    </w:p>
+    <w:p>
+      <w:pPr>
+        <w:rPr>
+          <w:rFonts w:cstheme="minorHAnsi"/>
+          <w:b/>
+          <w:bCs/>
+        </w:rPr>
+      </w:pPr>
+      <w:r>
+        <w:rPr>
+          <w:rFonts w:ascii="Segoe UI Emoji" w:hAnsi="Segoe UI Emoji" w:cs="Segoe UI Emoji"/>
+          <w:b/>
+          <w:bCs/>
+        </w:rPr>
+        <w:lastRenderedPageBreak/>
         <w:t>🔹</w:t>
       </w:r>
       <w:r>
@@ -7613,6 +9397,13 @@
           <w:rFonts w:cstheme="minorHAnsi"/>
         </w:rPr>
       </w:pPr>
+    </w:p>
+    <w:p>
+      <w:pPr>
+        <w:rPr>
+          <w:rFonts w:cstheme="minorHAnsi"/>
+        </w:rPr>
+      </w:pPr>
       <w:r>
         <w:rPr>
           <w:rFonts w:ascii="Segoe UI Emoji" w:hAnsi="Segoe UI Emoji" w:cs="Segoe UI Emoji"/>
@@ -7792,7 +9583,6 @@
           <w:b/>
           <w:bCs/>
         </w:rPr>
-        <w:lastRenderedPageBreak/>
         <w:t>🔹</w:t>
       </w:r>
       <w:r>
@@ -8036,6 +9826,7 @@
         <w:rPr>
           <w:rFonts w:cstheme="minorHAnsi"/>
         </w:rPr>
+        <w:lastRenderedPageBreak/>
         <w:t>Later flatten/transform only required attributes → avoids table explosion.</w:t>
       </w:r>
     </w:p>
@@ -10724,6 +12515,155 @@
     </w:lvl>
   </w:abstractNum>
   <w:abstractNum w:abstractNumId="16" w15:restartNumberingAfterBreak="0">
+    <w:nsid w:val="2C6C6090"/>
+    <w:multiLevelType w:val="multilevel"/>
+    <w:tmpl w:val="9F2C008C"/>
+    <w:lvl w:ilvl="0">
+      <w:start w:val="1"/>
+      <w:numFmt w:val="bullet"/>
+      <w:lvlText w:val=""/>
+      <w:lvlJc w:val="left"/>
+      <w:pPr>
+        <w:tabs>
+          <w:tab w:val="num" w:pos="720"/>
+        </w:tabs>
+        <w:ind w:left="720" w:hanging="360"/>
+      </w:pPr>
+      <w:rPr>
+        <w:rFonts w:ascii="Symbol" w:hAnsi="Symbol" w:hint="default"/>
+        <w:sz w:val="20"/>
+      </w:rPr>
+    </w:lvl>
+    <w:lvl w:ilvl="1" w:tentative="1">
+      <w:start w:val="1"/>
+      <w:numFmt w:val="bullet"/>
+      <w:lvlText w:val="o"/>
+      <w:lvlJc w:val="left"/>
+      <w:pPr>
+        <w:tabs>
+          <w:tab w:val="num" w:pos="1440"/>
+        </w:tabs>
+        <w:ind w:left="1440" w:hanging="360"/>
+      </w:pPr>
+      <w:rPr>
+        <w:rFonts w:ascii="Courier New" w:hAnsi="Courier New" w:hint="default"/>
+        <w:sz w:val="20"/>
+      </w:rPr>
+    </w:lvl>
+    <w:lvl w:ilvl="2" w:tentative="1">
+      <w:start w:val="1"/>
+      <w:numFmt w:val="bullet"/>
+      <w:lvlText w:val=""/>
+      <w:lvlJc w:val="left"/>
+      <w:pPr>
+        <w:tabs>
+          <w:tab w:val="num" w:pos="2160"/>
+        </w:tabs>
+        <w:ind w:left="2160" w:hanging="360"/>
+      </w:pPr>
+      <w:rPr>
+        <w:rFonts w:ascii="Wingdings" w:hAnsi="Wingdings" w:hint="default"/>
+        <w:sz w:val="20"/>
+      </w:rPr>
+    </w:lvl>
+    <w:lvl w:ilvl="3" w:tentative="1">
+      <w:start w:val="1"/>
+      <w:numFmt w:val="bullet"/>
+      <w:lvlText w:val=""/>
+      <w:lvlJc w:val="left"/>
+      <w:pPr>
+        <w:tabs>
+          <w:tab w:val="num" w:pos="2880"/>
+        </w:tabs>
+        <w:ind w:left="2880" w:hanging="360"/>
+      </w:pPr>
+      <w:rPr>
+        <w:rFonts w:ascii="Wingdings" w:hAnsi="Wingdings" w:hint="default"/>
+        <w:sz w:val="20"/>
+      </w:rPr>
+    </w:lvl>
+    <w:lvl w:ilvl="4" w:tentative="1">
+      <w:start w:val="1"/>
+      <w:numFmt w:val="bullet"/>
+      <w:lvlText w:val=""/>
+      <w:lvlJc w:val="left"/>
+      <w:pPr>
+        <w:tabs>
+          <w:tab w:val="num" w:pos="3600"/>
+        </w:tabs>
+        <w:ind w:left="3600" w:hanging="360"/>
+      </w:pPr>
+      <w:rPr>
+        <w:rFonts w:ascii="Wingdings" w:hAnsi="Wingdings" w:hint="default"/>
+        <w:sz w:val="20"/>
+      </w:rPr>
+    </w:lvl>
+    <w:lvl w:ilvl="5" w:tentative="1">
+      <w:start w:val="1"/>
+      <w:numFmt w:val="bullet"/>
+      <w:lvlText w:val=""/>
+      <w:lvlJc w:val="left"/>
+      <w:pPr>
+        <w:tabs>
+          <w:tab w:val="num" w:pos="4320"/>
+        </w:tabs>
+        <w:ind w:left="4320" w:hanging="360"/>
+      </w:pPr>
+      <w:rPr>
+        <w:rFonts w:ascii="Wingdings" w:hAnsi="Wingdings" w:hint="default"/>
+        <w:sz w:val="20"/>
+      </w:rPr>
+    </w:lvl>
+    <w:lvl w:ilvl="6" w:tentative="1">
+      <w:start w:val="1"/>
+      <w:numFmt w:val="bullet"/>
+      <w:lvlText w:val=""/>
+      <w:lvlJc w:val="left"/>
+      <w:pPr>
+        <w:tabs>
+          <w:tab w:val="num" w:pos="5040"/>
+        </w:tabs>
+        <w:ind w:left="5040" w:hanging="360"/>
+      </w:pPr>
+      <w:rPr>
+        <w:rFonts w:ascii="Wingdings" w:hAnsi="Wingdings" w:hint="default"/>
+        <w:sz w:val="20"/>
+      </w:rPr>
+    </w:lvl>
+    <w:lvl w:ilvl="7" w:tentative="1">
+      <w:start w:val="1"/>
+      <w:numFmt w:val="bullet"/>
+      <w:lvlText w:val=""/>
+      <w:lvlJc w:val="left"/>
+      <w:pPr>
+        <w:tabs>
+          <w:tab w:val="num" w:pos="5760"/>
+        </w:tabs>
+        <w:ind w:left="5760" w:hanging="360"/>
+      </w:pPr>
+      <w:rPr>
+        <w:rFonts w:ascii="Wingdings" w:hAnsi="Wingdings" w:hint="default"/>
+        <w:sz w:val="20"/>
+      </w:rPr>
+    </w:lvl>
+    <w:lvl w:ilvl="8" w:tentative="1">
+      <w:start w:val="1"/>
+      <w:numFmt w:val="bullet"/>
+      <w:lvlText w:val=""/>
+      <w:lvlJc w:val="left"/>
+      <w:pPr>
+        <w:tabs>
+          <w:tab w:val="num" w:pos="6480"/>
+        </w:tabs>
+        <w:ind w:left="6480" w:hanging="360"/>
+      </w:pPr>
+      <w:rPr>
+        <w:rFonts w:ascii="Wingdings" w:hAnsi="Wingdings" w:hint="default"/>
+        <w:sz w:val="20"/>
+      </w:rPr>
+    </w:lvl>
+  </w:abstractNum>
+  <w:abstractNum w:abstractNumId="17" w15:restartNumberingAfterBreak="0">
     <w:nsid w:val="2F5D4BC1"/>
     <w:multiLevelType w:val="multilevel"/>
     <w:tmpl w:val="BC5EF4DA"/>
@@ -10872,7 +12812,156 @@
       </w:rPr>
     </w:lvl>
   </w:abstractNum>
-  <w:abstractNum w:abstractNumId="17" w15:restartNumberingAfterBreak="0">
+  <w:abstractNum w:abstractNumId="18" w15:restartNumberingAfterBreak="0">
+    <w:nsid w:val="3023589F"/>
+    <w:multiLevelType w:val="multilevel"/>
+    <w:tmpl w:val="37729E84"/>
+    <w:lvl w:ilvl="0">
+      <w:start w:val="1"/>
+      <w:numFmt w:val="bullet"/>
+      <w:lvlText w:val=""/>
+      <w:lvlJc w:val="left"/>
+      <w:pPr>
+        <w:tabs>
+          <w:tab w:val="num" w:pos="720"/>
+        </w:tabs>
+        <w:ind w:left="720" w:hanging="360"/>
+      </w:pPr>
+      <w:rPr>
+        <w:rFonts w:ascii="Symbol" w:hAnsi="Symbol" w:hint="default"/>
+        <w:sz w:val="20"/>
+      </w:rPr>
+    </w:lvl>
+    <w:lvl w:ilvl="1">
+      <w:start w:val="1"/>
+      <w:numFmt w:val="bullet"/>
+      <w:lvlText w:val="o"/>
+      <w:lvlJc w:val="left"/>
+      <w:pPr>
+        <w:tabs>
+          <w:tab w:val="num" w:pos="1440"/>
+        </w:tabs>
+        <w:ind w:left="1440" w:hanging="360"/>
+      </w:pPr>
+      <w:rPr>
+        <w:rFonts w:ascii="Courier New" w:hAnsi="Courier New" w:hint="default"/>
+        <w:sz w:val="20"/>
+      </w:rPr>
+    </w:lvl>
+    <w:lvl w:ilvl="2" w:tentative="1">
+      <w:start w:val="1"/>
+      <w:numFmt w:val="bullet"/>
+      <w:lvlText w:val=""/>
+      <w:lvlJc w:val="left"/>
+      <w:pPr>
+        <w:tabs>
+          <w:tab w:val="num" w:pos="2160"/>
+        </w:tabs>
+        <w:ind w:left="2160" w:hanging="360"/>
+      </w:pPr>
+      <w:rPr>
+        <w:rFonts w:ascii="Wingdings" w:hAnsi="Wingdings" w:hint="default"/>
+        <w:sz w:val="20"/>
+      </w:rPr>
+    </w:lvl>
+    <w:lvl w:ilvl="3" w:tentative="1">
+      <w:start w:val="1"/>
+      <w:numFmt w:val="bullet"/>
+      <w:lvlText w:val=""/>
+      <w:lvlJc w:val="left"/>
+      <w:pPr>
+        <w:tabs>
+          <w:tab w:val="num" w:pos="2880"/>
+        </w:tabs>
+        <w:ind w:left="2880" w:hanging="360"/>
+      </w:pPr>
+      <w:rPr>
+        <w:rFonts w:ascii="Wingdings" w:hAnsi="Wingdings" w:hint="default"/>
+        <w:sz w:val="20"/>
+      </w:rPr>
+    </w:lvl>
+    <w:lvl w:ilvl="4" w:tentative="1">
+      <w:start w:val="1"/>
+      <w:numFmt w:val="bullet"/>
+      <w:lvlText w:val=""/>
+      <w:lvlJc w:val="left"/>
+      <w:pPr>
+        <w:tabs>
+          <w:tab w:val="num" w:pos="3600"/>
+        </w:tabs>
+        <w:ind w:left="3600" w:hanging="360"/>
+      </w:pPr>
+      <w:rPr>
+        <w:rFonts w:ascii="Wingdings" w:hAnsi="Wingdings" w:hint="default"/>
+        <w:sz w:val="20"/>
+      </w:rPr>
+    </w:lvl>
+    <w:lvl w:ilvl="5" w:tentative="1">
+      <w:start w:val="1"/>
+      <w:numFmt w:val="bullet"/>
+      <w:lvlText w:val=""/>
+      <w:lvlJc w:val="left"/>
+      <w:pPr>
+        <w:tabs>
+          <w:tab w:val="num" w:pos="4320"/>
+        </w:tabs>
+        <w:ind w:left="4320" w:hanging="360"/>
+      </w:pPr>
+      <w:rPr>
+        <w:rFonts w:ascii="Wingdings" w:hAnsi="Wingdings" w:hint="default"/>
+        <w:sz w:val="20"/>
+      </w:rPr>
+    </w:lvl>
+    <w:lvl w:ilvl="6" w:tentative="1">
+      <w:start w:val="1"/>
+      <w:numFmt w:val="bullet"/>
+      <w:lvlText w:val=""/>
+      <w:lvlJc w:val="left"/>
+      <w:pPr>
+        <w:tabs>
+          <w:tab w:val="num" w:pos="5040"/>
+        </w:tabs>
+        <w:ind w:left="5040" w:hanging="360"/>
+      </w:pPr>
+      <w:rPr>
+        <w:rFonts w:ascii="Wingdings" w:hAnsi="Wingdings" w:hint="default"/>
+        <w:sz w:val="20"/>
+      </w:rPr>
+    </w:lvl>
+    <w:lvl w:ilvl="7" w:tentative="1">
+      <w:start w:val="1"/>
+      <w:numFmt w:val="bullet"/>
+      <w:lvlText w:val=""/>
+      <w:lvlJc w:val="left"/>
+      <w:pPr>
+        <w:tabs>
+          <w:tab w:val="num" w:pos="5760"/>
+        </w:tabs>
+        <w:ind w:left="5760" w:hanging="360"/>
+      </w:pPr>
+      <w:rPr>
+        <w:rFonts w:ascii="Wingdings" w:hAnsi="Wingdings" w:hint="default"/>
+        <w:sz w:val="20"/>
+      </w:rPr>
+    </w:lvl>
+    <w:lvl w:ilvl="8" w:tentative="1">
+      <w:start w:val="1"/>
+      <w:numFmt w:val="bullet"/>
+      <w:lvlText w:val=""/>
+      <w:lvlJc w:val="left"/>
+      <w:pPr>
+        <w:tabs>
+          <w:tab w:val="num" w:pos="6480"/>
+        </w:tabs>
+        <w:ind w:left="6480" w:hanging="360"/>
+      </w:pPr>
+      <w:rPr>
+        <w:rFonts w:ascii="Wingdings" w:hAnsi="Wingdings" w:hint="default"/>
+        <w:sz w:val="20"/>
+      </w:rPr>
+    </w:lvl>
+  </w:abstractNum>
+  <w:abstractNum w:abstractNumId="19" w15:restartNumberingAfterBreak="0">
     <w:nsid w:val="30DB7740"/>
     <w:multiLevelType w:val="multilevel"/>
     <w:tmpl w:val="539A9F4A"/>
@@ -11021,7 +13110,7 @@
       </w:rPr>
     </w:lvl>
   </w:abstractNum>
-  <w:abstractNum w:abstractNumId="18" w15:restartNumberingAfterBreak="0">
+  <w:abstractNum w:abstractNumId="20" w15:restartNumberingAfterBreak="0">
     <w:nsid w:val="34C7075E"/>
     <w:multiLevelType w:val="multilevel"/>
     <w:tmpl w:val="92A4175C"/>
@@ -11170,7 +13259,7 @@
       </w:rPr>
     </w:lvl>
   </w:abstractNum>
-  <w:abstractNum w:abstractNumId="19" w15:restartNumberingAfterBreak="0">
+  <w:abstractNum w:abstractNumId="21" w15:restartNumberingAfterBreak="0">
     <w:nsid w:val="37EE758C"/>
     <w:multiLevelType w:val="multilevel"/>
     <w:tmpl w:val="B34AB58E"/>
@@ -11319,7 +13408,156 @@
       </w:rPr>
     </w:lvl>
   </w:abstractNum>
-  <w:abstractNum w:abstractNumId="20" w15:restartNumberingAfterBreak="0">
+  <w:abstractNum w:abstractNumId="22" w15:restartNumberingAfterBreak="0">
+    <w:nsid w:val="3AE34FB4"/>
+    <w:multiLevelType w:val="multilevel"/>
+    <w:tmpl w:val="FFAE3F70"/>
+    <w:lvl w:ilvl="0">
+      <w:start w:val="1"/>
+      <w:numFmt w:val="bullet"/>
+      <w:lvlText w:val=""/>
+      <w:lvlJc w:val="left"/>
+      <w:pPr>
+        <w:tabs>
+          <w:tab w:val="num" w:pos="720"/>
+        </w:tabs>
+        <w:ind w:left="720" w:hanging="360"/>
+      </w:pPr>
+      <w:rPr>
+        <w:rFonts w:ascii="Symbol" w:hAnsi="Symbol" w:hint="default"/>
+        <w:sz w:val="20"/>
+      </w:rPr>
+    </w:lvl>
+    <w:lvl w:ilvl="1" w:tentative="1">
+      <w:start w:val="1"/>
+      <w:numFmt w:val="bullet"/>
+      <w:lvlText w:val="o"/>
+      <w:lvlJc w:val="left"/>
+      <w:pPr>
+        <w:tabs>
+          <w:tab w:val="num" w:pos="1440"/>
+        </w:tabs>
+        <w:ind w:left="1440" w:hanging="360"/>
+      </w:pPr>
+      <w:rPr>
+        <w:rFonts w:ascii="Courier New" w:hAnsi="Courier New" w:hint="default"/>
+        <w:sz w:val="20"/>
+      </w:rPr>
+    </w:lvl>
+    <w:lvl w:ilvl="2" w:tentative="1">
+      <w:start w:val="1"/>
+      <w:numFmt w:val="bullet"/>
+      <w:lvlText w:val=""/>
+      <w:lvlJc w:val="left"/>
+      <w:pPr>
+        <w:tabs>
+          <w:tab w:val="num" w:pos="2160"/>
+        </w:tabs>
+        <w:ind w:left="2160" w:hanging="360"/>
+      </w:pPr>
+      <w:rPr>
+        <w:rFonts w:ascii="Wingdings" w:hAnsi="Wingdings" w:hint="default"/>
+        <w:sz w:val="20"/>
+      </w:rPr>
+    </w:lvl>
+    <w:lvl w:ilvl="3" w:tentative="1">
+      <w:start w:val="1"/>
+      <w:numFmt w:val="bullet"/>
+      <w:lvlText w:val=""/>
+      <w:lvlJc w:val="left"/>
+      <w:pPr>
+        <w:tabs>
+          <w:tab w:val="num" w:pos="2880"/>
+        </w:tabs>
+        <w:ind w:left="2880" w:hanging="360"/>
+      </w:pPr>
+      <w:rPr>
+        <w:rFonts w:ascii="Wingdings" w:hAnsi="Wingdings" w:hint="default"/>
+        <w:sz w:val="20"/>
+      </w:rPr>
+    </w:lvl>
+    <w:lvl w:ilvl="4" w:tentative="1">
+      <w:start w:val="1"/>
+      <w:numFmt w:val="bullet"/>
+      <w:lvlText w:val=""/>
+      <w:lvlJc w:val="left"/>
+      <w:pPr>
+        <w:tabs>
+          <w:tab w:val="num" w:pos="3600"/>
+        </w:tabs>
+        <w:ind w:left="3600" w:hanging="360"/>
+      </w:pPr>
+      <w:rPr>
+        <w:rFonts w:ascii="Wingdings" w:hAnsi="Wingdings" w:hint="default"/>
+        <w:sz w:val="20"/>
+      </w:rPr>
+    </w:lvl>
+    <w:lvl w:ilvl="5" w:tentative="1">
+      <w:start w:val="1"/>
+      <w:numFmt w:val="bullet"/>
+      <w:lvlText w:val=""/>
+      <w:lvlJc w:val="left"/>
+      <w:pPr>
+        <w:tabs>
+          <w:tab w:val="num" w:pos="4320"/>
+        </w:tabs>
+        <w:ind w:left="4320" w:hanging="360"/>
+      </w:pPr>
+      <w:rPr>
+        <w:rFonts w:ascii="Wingdings" w:hAnsi="Wingdings" w:hint="default"/>
+        <w:sz w:val="20"/>
+      </w:rPr>
+    </w:lvl>
+    <w:lvl w:ilvl="6" w:tentative="1">
+      <w:start w:val="1"/>
+      <w:numFmt w:val="bullet"/>
+      <w:lvlText w:val=""/>
+      <w:lvlJc w:val="left"/>
+      <w:pPr>
+        <w:tabs>
+          <w:tab w:val="num" w:pos="5040"/>
+        </w:tabs>
+        <w:ind w:left="5040" w:hanging="360"/>
+      </w:pPr>
+      <w:rPr>
+        <w:rFonts w:ascii="Wingdings" w:hAnsi="Wingdings" w:hint="default"/>
+        <w:sz w:val="20"/>
+      </w:rPr>
+    </w:lvl>
+    <w:lvl w:ilvl="7" w:tentative="1">
+      <w:start w:val="1"/>
+      <w:numFmt w:val="bullet"/>
+      <w:lvlText w:val=""/>
+      <w:lvlJc w:val="left"/>
+      <w:pPr>
+        <w:tabs>
+          <w:tab w:val="num" w:pos="5760"/>
+        </w:tabs>
+        <w:ind w:left="5760" w:hanging="360"/>
+      </w:pPr>
+      <w:rPr>
+        <w:rFonts w:ascii="Wingdings" w:hAnsi="Wingdings" w:hint="default"/>
+        <w:sz w:val="20"/>
+      </w:rPr>
+    </w:lvl>
+    <w:lvl w:ilvl="8" w:tentative="1">
+      <w:start w:val="1"/>
+      <w:numFmt w:val="bullet"/>
+      <w:lvlText w:val=""/>
+      <w:lvlJc w:val="left"/>
+      <w:pPr>
+        <w:tabs>
+          <w:tab w:val="num" w:pos="6480"/>
+        </w:tabs>
+        <w:ind w:left="6480" w:hanging="360"/>
+      </w:pPr>
+      <w:rPr>
+        <w:rFonts w:ascii="Wingdings" w:hAnsi="Wingdings" w:hint="default"/>
+        <w:sz w:val="20"/>
+      </w:rPr>
+    </w:lvl>
+  </w:abstractNum>
+  <w:abstractNum w:abstractNumId="23" w15:restartNumberingAfterBreak="0">
     <w:nsid w:val="3B881FB9"/>
     <w:multiLevelType w:val="multilevel"/>
     <w:tmpl w:val="6FC44E28"/>
@@ -11468,7 +13706,156 @@
       </w:rPr>
     </w:lvl>
   </w:abstractNum>
-  <w:abstractNum w:abstractNumId="21" w15:restartNumberingAfterBreak="0">
+  <w:abstractNum w:abstractNumId="24" w15:restartNumberingAfterBreak="0">
+    <w:nsid w:val="3BC3775B"/>
+    <w:multiLevelType w:val="multilevel"/>
+    <w:tmpl w:val="43403D0C"/>
+    <w:lvl w:ilvl="0">
+      <w:start w:val="1"/>
+      <w:numFmt w:val="bullet"/>
+      <w:lvlText w:val=""/>
+      <w:lvlJc w:val="left"/>
+      <w:pPr>
+        <w:tabs>
+          <w:tab w:val="num" w:pos="720"/>
+        </w:tabs>
+        <w:ind w:left="720" w:hanging="360"/>
+      </w:pPr>
+      <w:rPr>
+        <w:rFonts w:ascii="Symbol" w:hAnsi="Symbol" w:hint="default"/>
+        <w:sz w:val="20"/>
+      </w:rPr>
+    </w:lvl>
+    <w:lvl w:ilvl="1">
+      <w:start w:val="1"/>
+      <w:numFmt w:val="bullet"/>
+      <w:lvlText w:val="o"/>
+      <w:lvlJc w:val="left"/>
+      <w:pPr>
+        <w:tabs>
+          <w:tab w:val="num" w:pos="1440"/>
+        </w:tabs>
+        <w:ind w:left="1440" w:hanging="360"/>
+      </w:pPr>
+      <w:rPr>
+        <w:rFonts w:ascii="Courier New" w:hAnsi="Courier New" w:hint="default"/>
+        <w:sz w:val="20"/>
+      </w:rPr>
+    </w:lvl>
+    <w:lvl w:ilvl="2" w:tentative="1">
+      <w:start w:val="1"/>
+      <w:numFmt w:val="bullet"/>
+      <w:lvlText w:val=""/>
+      <w:lvlJc w:val="left"/>
+      <w:pPr>
+        <w:tabs>
+          <w:tab w:val="num" w:pos="2160"/>
+        </w:tabs>
+        <w:ind w:left="2160" w:hanging="360"/>
+      </w:pPr>
+      <w:rPr>
+        <w:rFonts w:ascii="Wingdings" w:hAnsi="Wingdings" w:hint="default"/>
+        <w:sz w:val="20"/>
+      </w:rPr>
+    </w:lvl>
+    <w:lvl w:ilvl="3" w:tentative="1">
+      <w:start w:val="1"/>
+      <w:numFmt w:val="bullet"/>
+      <w:lvlText w:val=""/>
+      <w:lvlJc w:val="left"/>
+      <w:pPr>
+        <w:tabs>
+          <w:tab w:val="num" w:pos="2880"/>
+        </w:tabs>
+        <w:ind w:left="2880" w:hanging="360"/>
+      </w:pPr>
+      <w:rPr>
+        <w:rFonts w:ascii="Wingdings" w:hAnsi="Wingdings" w:hint="default"/>
+        <w:sz w:val="20"/>
+      </w:rPr>
+    </w:lvl>
+    <w:lvl w:ilvl="4" w:tentative="1">
+      <w:start w:val="1"/>
+      <w:numFmt w:val="bullet"/>
+      <w:lvlText w:val=""/>
+      <w:lvlJc w:val="left"/>
+      <w:pPr>
+        <w:tabs>
+          <w:tab w:val="num" w:pos="3600"/>
+        </w:tabs>
+        <w:ind w:left="3600" w:hanging="360"/>
+      </w:pPr>
+      <w:rPr>
+        <w:rFonts w:ascii="Wingdings" w:hAnsi="Wingdings" w:hint="default"/>
+        <w:sz w:val="20"/>
+      </w:rPr>
+    </w:lvl>
+    <w:lvl w:ilvl="5" w:tentative="1">
+      <w:start w:val="1"/>
+      <w:numFmt w:val="bullet"/>
+      <w:lvlText w:val=""/>
+      <w:lvlJc w:val="left"/>
+      <w:pPr>
+        <w:tabs>
+          <w:tab w:val="num" w:pos="4320"/>
+        </w:tabs>
+        <w:ind w:left="4320" w:hanging="360"/>
+      </w:pPr>
+      <w:rPr>
+        <w:rFonts w:ascii="Wingdings" w:hAnsi="Wingdings" w:hint="default"/>
+        <w:sz w:val="20"/>
+      </w:rPr>
+    </w:lvl>
+    <w:lvl w:ilvl="6" w:tentative="1">
+      <w:start w:val="1"/>
+      <w:numFmt w:val="bullet"/>
+      <w:lvlText w:val=""/>
+      <w:lvlJc w:val="left"/>
+      <w:pPr>
+        <w:tabs>
+          <w:tab w:val="num" w:pos="5040"/>
+        </w:tabs>
+        <w:ind w:left="5040" w:hanging="360"/>
+      </w:pPr>
+      <w:rPr>
+        <w:rFonts w:ascii="Wingdings" w:hAnsi="Wingdings" w:hint="default"/>
+        <w:sz w:val="20"/>
+      </w:rPr>
+    </w:lvl>
+    <w:lvl w:ilvl="7" w:tentative="1">
+      <w:start w:val="1"/>
+      <w:numFmt w:val="bullet"/>
+      <w:lvlText w:val=""/>
+      <w:lvlJc w:val="left"/>
+      <w:pPr>
+        <w:tabs>
+          <w:tab w:val="num" w:pos="5760"/>
+        </w:tabs>
+        <w:ind w:left="5760" w:hanging="360"/>
+      </w:pPr>
+      <w:rPr>
+        <w:rFonts w:ascii="Wingdings" w:hAnsi="Wingdings" w:hint="default"/>
+        <w:sz w:val="20"/>
+      </w:rPr>
+    </w:lvl>
+    <w:lvl w:ilvl="8" w:tentative="1">
+      <w:start w:val="1"/>
+      <w:numFmt w:val="bullet"/>
+      <w:lvlText w:val=""/>
+      <w:lvlJc w:val="left"/>
+      <w:pPr>
+        <w:tabs>
+          <w:tab w:val="num" w:pos="6480"/>
+        </w:tabs>
+        <w:ind w:left="6480" w:hanging="360"/>
+      </w:pPr>
+      <w:rPr>
+        <w:rFonts w:ascii="Wingdings" w:hAnsi="Wingdings" w:hint="default"/>
+        <w:sz w:val="20"/>
+      </w:rPr>
+    </w:lvl>
+  </w:abstractNum>
+  <w:abstractNum w:abstractNumId="25" w15:restartNumberingAfterBreak="0">
     <w:nsid w:val="3C501770"/>
     <w:multiLevelType w:val="multilevel"/>
     <w:tmpl w:val="C810A08C"/>
@@ -11581,7 +13968,7 @@
       </w:pPr>
     </w:lvl>
   </w:abstractNum>
-  <w:abstractNum w:abstractNumId="22" w15:restartNumberingAfterBreak="0">
+  <w:abstractNum w:abstractNumId="26" w15:restartNumberingAfterBreak="0">
     <w:nsid w:val="3C775B3C"/>
     <w:multiLevelType w:val="multilevel"/>
     <w:tmpl w:val="ADA2C62A"/>
@@ -11730,7 +14117,7 @@
       </w:rPr>
     </w:lvl>
   </w:abstractNum>
-  <w:abstractNum w:abstractNumId="23" w15:restartNumberingAfterBreak="0">
+  <w:abstractNum w:abstractNumId="27" w15:restartNumberingAfterBreak="0">
     <w:nsid w:val="3D0E7A4A"/>
     <w:multiLevelType w:val="multilevel"/>
     <w:tmpl w:val="9C76F416"/>
@@ -11879,7 +14266,7 @@
       </w:rPr>
     </w:lvl>
   </w:abstractNum>
-  <w:abstractNum w:abstractNumId="24" w15:restartNumberingAfterBreak="0">
+  <w:abstractNum w:abstractNumId="28" w15:restartNumberingAfterBreak="0">
     <w:nsid w:val="3F5C7FC3"/>
     <w:multiLevelType w:val="multilevel"/>
     <w:tmpl w:val="7FEAC8B2"/>
@@ -12028,7 +14415,7 @@
       </w:rPr>
     </w:lvl>
   </w:abstractNum>
-  <w:abstractNum w:abstractNumId="25" w15:restartNumberingAfterBreak="0">
+  <w:abstractNum w:abstractNumId="29" w15:restartNumberingAfterBreak="0">
     <w:nsid w:val="411210CA"/>
     <w:multiLevelType w:val="multilevel"/>
     <w:tmpl w:val="93D6E528"/>
@@ -12177,7 +14564,7 @@
       </w:rPr>
     </w:lvl>
   </w:abstractNum>
-  <w:abstractNum w:abstractNumId="26" w15:restartNumberingAfterBreak="0">
+  <w:abstractNum w:abstractNumId="30" w15:restartNumberingAfterBreak="0">
     <w:nsid w:val="41E4101F"/>
     <w:multiLevelType w:val="multilevel"/>
     <w:tmpl w:val="6396D304"/>
@@ -12290,7 +14677,7 @@
       </w:pPr>
     </w:lvl>
   </w:abstractNum>
-  <w:abstractNum w:abstractNumId="27" w15:restartNumberingAfterBreak="0">
+  <w:abstractNum w:abstractNumId="31" w15:restartNumberingAfterBreak="0">
     <w:nsid w:val="42EF0C8C"/>
     <w:multiLevelType w:val="multilevel"/>
     <w:tmpl w:val="13A861C4"/>
@@ -12439,7 +14826,7 @@
       </w:rPr>
     </w:lvl>
   </w:abstractNum>
-  <w:abstractNum w:abstractNumId="28" w15:restartNumberingAfterBreak="0">
+  <w:abstractNum w:abstractNumId="32" w15:restartNumberingAfterBreak="0">
     <w:nsid w:val="453014EB"/>
     <w:multiLevelType w:val="multilevel"/>
     <w:tmpl w:val="603680DA"/>
@@ -12588,7 +14975,7 @@
       </w:rPr>
     </w:lvl>
   </w:abstractNum>
-  <w:abstractNum w:abstractNumId="29" w15:restartNumberingAfterBreak="0">
+  <w:abstractNum w:abstractNumId="33" w15:restartNumberingAfterBreak="0">
     <w:nsid w:val="474029B2"/>
     <w:multiLevelType w:val="multilevel"/>
     <w:tmpl w:val="79927B9C"/>
@@ -12737,7 +15124,305 @@
       </w:rPr>
     </w:lvl>
   </w:abstractNum>
-  <w:abstractNum w:abstractNumId="30" w15:restartNumberingAfterBreak="0">
+  <w:abstractNum w:abstractNumId="34" w15:restartNumberingAfterBreak="0">
+    <w:nsid w:val="47746DD3"/>
+    <w:multiLevelType w:val="multilevel"/>
+    <w:tmpl w:val="174E4FC4"/>
+    <w:lvl w:ilvl="0">
+      <w:start w:val="1"/>
+      <w:numFmt w:val="bullet"/>
+      <w:lvlText w:val=""/>
+      <w:lvlJc w:val="left"/>
+      <w:pPr>
+        <w:tabs>
+          <w:tab w:val="num" w:pos="720"/>
+        </w:tabs>
+        <w:ind w:left="720" w:hanging="360"/>
+      </w:pPr>
+      <w:rPr>
+        <w:rFonts w:ascii="Symbol" w:hAnsi="Symbol" w:hint="default"/>
+        <w:sz w:val="20"/>
+      </w:rPr>
+    </w:lvl>
+    <w:lvl w:ilvl="1" w:tentative="1">
+      <w:start w:val="1"/>
+      <w:numFmt w:val="bullet"/>
+      <w:lvlText w:val="o"/>
+      <w:lvlJc w:val="left"/>
+      <w:pPr>
+        <w:tabs>
+          <w:tab w:val="num" w:pos="1440"/>
+        </w:tabs>
+        <w:ind w:left="1440" w:hanging="360"/>
+      </w:pPr>
+      <w:rPr>
+        <w:rFonts w:ascii="Courier New" w:hAnsi="Courier New" w:hint="default"/>
+        <w:sz w:val="20"/>
+      </w:rPr>
+    </w:lvl>
+    <w:lvl w:ilvl="2" w:tentative="1">
+      <w:start w:val="1"/>
+      <w:numFmt w:val="bullet"/>
+      <w:lvlText w:val=""/>
+      <w:lvlJc w:val="left"/>
+      <w:pPr>
+        <w:tabs>
+          <w:tab w:val="num" w:pos="2160"/>
+        </w:tabs>
+        <w:ind w:left="2160" w:hanging="360"/>
+      </w:pPr>
+      <w:rPr>
+        <w:rFonts w:ascii="Wingdings" w:hAnsi="Wingdings" w:hint="default"/>
+        <w:sz w:val="20"/>
+      </w:rPr>
+    </w:lvl>
+    <w:lvl w:ilvl="3" w:tentative="1">
+      <w:start w:val="1"/>
+      <w:numFmt w:val="bullet"/>
+      <w:lvlText w:val=""/>
+      <w:lvlJc w:val="left"/>
+      <w:pPr>
+        <w:tabs>
+          <w:tab w:val="num" w:pos="2880"/>
+        </w:tabs>
+        <w:ind w:left="2880" w:hanging="360"/>
+      </w:pPr>
+      <w:rPr>
+        <w:rFonts w:ascii="Wingdings" w:hAnsi="Wingdings" w:hint="default"/>
+        <w:sz w:val="20"/>
+      </w:rPr>
+    </w:lvl>
+    <w:lvl w:ilvl="4" w:tentative="1">
+      <w:start w:val="1"/>
+      <w:numFmt w:val="bullet"/>
+      <w:lvlText w:val=""/>
+      <w:lvlJc w:val="left"/>
+      <w:pPr>
+        <w:tabs>
+          <w:tab w:val="num" w:pos="3600"/>
+        </w:tabs>
+        <w:ind w:left="3600" w:hanging="360"/>
+      </w:pPr>
+      <w:rPr>
+        <w:rFonts w:ascii="Wingdings" w:hAnsi="Wingdings" w:hint="default"/>
+        <w:sz w:val="20"/>
+      </w:rPr>
+    </w:lvl>
+    <w:lvl w:ilvl="5" w:tentative="1">
+      <w:start w:val="1"/>
+      <w:numFmt w:val="bullet"/>
+      <w:lvlText w:val=""/>
+      <w:lvlJc w:val="left"/>
+      <w:pPr>
+        <w:tabs>
+          <w:tab w:val="num" w:pos="4320"/>
+        </w:tabs>
+        <w:ind w:left="4320" w:hanging="360"/>
+      </w:pPr>
+      <w:rPr>
+        <w:rFonts w:ascii="Wingdings" w:hAnsi="Wingdings" w:hint="default"/>
+        <w:sz w:val="20"/>
+      </w:rPr>
+    </w:lvl>
+    <w:lvl w:ilvl="6" w:tentative="1">
+      <w:start w:val="1"/>
+      <w:numFmt w:val="bullet"/>
+      <w:lvlText w:val=""/>
+      <w:lvlJc w:val="left"/>
+      <w:pPr>
+        <w:tabs>
+          <w:tab w:val="num" w:pos="5040"/>
+        </w:tabs>
+        <w:ind w:left="5040" w:hanging="360"/>
+      </w:pPr>
+      <w:rPr>
+        <w:rFonts w:ascii="Wingdings" w:hAnsi="Wingdings" w:hint="default"/>
+        <w:sz w:val="20"/>
+      </w:rPr>
+    </w:lvl>
+    <w:lvl w:ilvl="7" w:tentative="1">
+      <w:start w:val="1"/>
+      <w:numFmt w:val="bullet"/>
+      <w:lvlText w:val=""/>
+      <w:lvlJc w:val="left"/>
+      <w:pPr>
+        <w:tabs>
+          <w:tab w:val="num" w:pos="5760"/>
+        </w:tabs>
+        <w:ind w:left="5760" w:hanging="360"/>
+      </w:pPr>
+      <w:rPr>
+        <w:rFonts w:ascii="Wingdings" w:hAnsi="Wingdings" w:hint="default"/>
+        <w:sz w:val="20"/>
+      </w:rPr>
+    </w:lvl>
+    <w:lvl w:ilvl="8" w:tentative="1">
+      <w:start w:val="1"/>
+      <w:numFmt w:val="bullet"/>
+      <w:lvlText w:val=""/>
+      <w:lvlJc w:val="left"/>
+      <w:pPr>
+        <w:tabs>
+          <w:tab w:val="num" w:pos="6480"/>
+        </w:tabs>
+        <w:ind w:left="6480" w:hanging="360"/>
+      </w:pPr>
+      <w:rPr>
+        <w:rFonts w:ascii="Wingdings" w:hAnsi="Wingdings" w:hint="default"/>
+        <w:sz w:val="20"/>
+      </w:rPr>
+    </w:lvl>
+  </w:abstractNum>
+  <w:abstractNum w:abstractNumId="35" w15:restartNumberingAfterBreak="0">
+    <w:nsid w:val="48EB1E31"/>
+    <w:multiLevelType w:val="multilevel"/>
+    <w:tmpl w:val="05FC0650"/>
+    <w:lvl w:ilvl="0">
+      <w:start w:val="1"/>
+      <w:numFmt w:val="bullet"/>
+      <w:lvlText w:val=""/>
+      <w:lvlJc w:val="left"/>
+      <w:pPr>
+        <w:tabs>
+          <w:tab w:val="num" w:pos="720"/>
+        </w:tabs>
+        <w:ind w:left="720" w:hanging="360"/>
+      </w:pPr>
+      <w:rPr>
+        <w:rFonts w:ascii="Symbol" w:hAnsi="Symbol" w:hint="default"/>
+        <w:sz w:val="20"/>
+      </w:rPr>
+    </w:lvl>
+    <w:lvl w:ilvl="1">
+      <w:start w:val="1"/>
+      <w:numFmt w:val="bullet"/>
+      <w:lvlText w:val="o"/>
+      <w:lvlJc w:val="left"/>
+      <w:pPr>
+        <w:tabs>
+          <w:tab w:val="num" w:pos="1440"/>
+        </w:tabs>
+        <w:ind w:left="1440" w:hanging="360"/>
+      </w:pPr>
+      <w:rPr>
+        <w:rFonts w:ascii="Courier New" w:hAnsi="Courier New" w:hint="default"/>
+        <w:sz w:val="20"/>
+      </w:rPr>
+    </w:lvl>
+    <w:lvl w:ilvl="2" w:tentative="1">
+      <w:start w:val="1"/>
+      <w:numFmt w:val="bullet"/>
+      <w:lvlText w:val=""/>
+      <w:lvlJc w:val="left"/>
+      <w:pPr>
+        <w:tabs>
+          <w:tab w:val="num" w:pos="2160"/>
+        </w:tabs>
+        <w:ind w:left="2160" w:hanging="360"/>
+      </w:pPr>
+      <w:rPr>
+        <w:rFonts w:ascii="Wingdings" w:hAnsi="Wingdings" w:hint="default"/>
+        <w:sz w:val="20"/>
+      </w:rPr>
+    </w:lvl>
+    <w:lvl w:ilvl="3" w:tentative="1">
+      <w:start w:val="1"/>
+      <w:numFmt w:val="bullet"/>
+      <w:lvlText w:val=""/>
+      <w:lvlJc w:val="left"/>
+      <w:pPr>
+        <w:tabs>
+          <w:tab w:val="num" w:pos="2880"/>
+        </w:tabs>
+        <w:ind w:left="2880" w:hanging="360"/>
+      </w:pPr>
+      <w:rPr>
+        <w:rFonts w:ascii="Wingdings" w:hAnsi="Wingdings" w:hint="default"/>
+        <w:sz w:val="20"/>
+      </w:rPr>
+    </w:lvl>
+    <w:lvl w:ilvl="4" w:tentative="1">
+      <w:start w:val="1"/>
+      <w:numFmt w:val="bullet"/>
+      <w:lvlText w:val=""/>
+      <w:lvlJc w:val="left"/>
+      <w:pPr>
+        <w:tabs>
+          <w:tab w:val="num" w:pos="3600"/>
+        </w:tabs>
+        <w:ind w:left="3600" w:hanging="360"/>
+      </w:pPr>
+      <w:rPr>
+        <w:rFonts w:ascii="Wingdings" w:hAnsi="Wingdings" w:hint="default"/>
+        <w:sz w:val="20"/>
+      </w:rPr>
+    </w:lvl>
+    <w:lvl w:ilvl="5" w:tentative="1">
+      <w:start w:val="1"/>
+      <w:numFmt w:val="bullet"/>
+      <w:lvlText w:val=""/>
+      <w:lvlJc w:val="left"/>
+      <w:pPr>
+        <w:tabs>
+          <w:tab w:val="num" w:pos="4320"/>
+        </w:tabs>
+        <w:ind w:left="4320" w:hanging="360"/>
+      </w:pPr>
+      <w:rPr>
+        <w:rFonts w:ascii="Wingdings" w:hAnsi="Wingdings" w:hint="default"/>
+        <w:sz w:val="20"/>
+      </w:rPr>
+    </w:lvl>
+    <w:lvl w:ilvl="6" w:tentative="1">
+      <w:start w:val="1"/>
+      <w:numFmt w:val="bullet"/>
+      <w:lvlText w:val=""/>
+      <w:lvlJc w:val="left"/>
+      <w:pPr>
+        <w:tabs>
+          <w:tab w:val="num" w:pos="5040"/>
+        </w:tabs>
+        <w:ind w:left="5040" w:hanging="360"/>
+      </w:pPr>
+      <w:rPr>
+        <w:rFonts w:ascii="Wingdings" w:hAnsi="Wingdings" w:hint="default"/>
+        <w:sz w:val="20"/>
+      </w:rPr>
+    </w:lvl>
+    <w:lvl w:ilvl="7" w:tentative="1">
+      <w:start w:val="1"/>
+      <w:numFmt w:val="bullet"/>
+      <w:lvlText w:val=""/>
+      <w:lvlJc w:val="left"/>
+      <w:pPr>
+        <w:tabs>
+          <w:tab w:val="num" w:pos="5760"/>
+        </w:tabs>
+        <w:ind w:left="5760" w:hanging="360"/>
+      </w:pPr>
+      <w:rPr>
+        <w:rFonts w:ascii="Wingdings" w:hAnsi="Wingdings" w:hint="default"/>
+        <w:sz w:val="20"/>
+      </w:rPr>
+    </w:lvl>
+    <w:lvl w:ilvl="8" w:tentative="1">
+      <w:start w:val="1"/>
+      <w:numFmt w:val="bullet"/>
+      <w:lvlText w:val=""/>
+      <w:lvlJc w:val="left"/>
+      <w:pPr>
+        <w:tabs>
+          <w:tab w:val="num" w:pos="6480"/>
+        </w:tabs>
+        <w:ind w:left="6480" w:hanging="360"/>
+      </w:pPr>
+      <w:rPr>
+        <w:rFonts w:ascii="Wingdings" w:hAnsi="Wingdings" w:hint="default"/>
+        <w:sz w:val="20"/>
+      </w:rPr>
+    </w:lvl>
+  </w:abstractNum>
+  <w:abstractNum w:abstractNumId="36" w15:restartNumberingAfterBreak="0">
     <w:nsid w:val="499758A2"/>
     <w:multiLevelType w:val="multilevel"/>
     <w:tmpl w:val="352E791C"/>
@@ -12886,7 +15571,7 @@
       </w:rPr>
     </w:lvl>
   </w:abstractNum>
-  <w:abstractNum w:abstractNumId="31" w15:restartNumberingAfterBreak="0">
+  <w:abstractNum w:abstractNumId="37" w15:restartNumberingAfterBreak="0">
     <w:nsid w:val="49E62F77"/>
     <w:multiLevelType w:val="multilevel"/>
     <w:tmpl w:val="6660DCE8"/>
@@ -13035,7 +15720,7 @@
       </w:rPr>
     </w:lvl>
   </w:abstractNum>
-  <w:abstractNum w:abstractNumId="32" w15:restartNumberingAfterBreak="0">
+  <w:abstractNum w:abstractNumId="38" w15:restartNumberingAfterBreak="0">
     <w:nsid w:val="4CD84A22"/>
     <w:multiLevelType w:val="multilevel"/>
     <w:tmpl w:val="870442B2"/>
@@ -13184,7 +15869,7 @@
       </w:rPr>
     </w:lvl>
   </w:abstractNum>
-  <w:abstractNum w:abstractNumId="33" w15:restartNumberingAfterBreak="0">
+  <w:abstractNum w:abstractNumId="39" w15:restartNumberingAfterBreak="0">
     <w:nsid w:val="4F216D9E"/>
     <w:multiLevelType w:val="multilevel"/>
     <w:tmpl w:val="418042EC"/>
@@ -13333,7 +16018,7 @@
       </w:rPr>
     </w:lvl>
   </w:abstractNum>
-  <w:abstractNum w:abstractNumId="34" w15:restartNumberingAfterBreak="0">
+  <w:abstractNum w:abstractNumId="40" w15:restartNumberingAfterBreak="0">
     <w:nsid w:val="4F744D11"/>
     <w:multiLevelType w:val="multilevel"/>
     <w:tmpl w:val="8A707854"/>
@@ -13482,7 +16167,7 @@
       </w:rPr>
     </w:lvl>
   </w:abstractNum>
-  <w:abstractNum w:abstractNumId="35" w15:restartNumberingAfterBreak="0">
+  <w:abstractNum w:abstractNumId="41" w15:restartNumberingAfterBreak="0">
     <w:nsid w:val="4FE1255D"/>
     <w:multiLevelType w:val="multilevel"/>
     <w:tmpl w:val="35A690D2"/>
@@ -13631,7 +16316,7 @@
       </w:rPr>
     </w:lvl>
   </w:abstractNum>
-  <w:abstractNum w:abstractNumId="36" w15:restartNumberingAfterBreak="0">
+  <w:abstractNum w:abstractNumId="42" w15:restartNumberingAfterBreak="0">
     <w:nsid w:val="50AA56F9"/>
     <w:multiLevelType w:val="multilevel"/>
     <w:tmpl w:val="AFEA16CE"/>
@@ -13780,7 +16465,7 @@
       </w:rPr>
     </w:lvl>
   </w:abstractNum>
-  <w:abstractNum w:abstractNumId="37" w15:restartNumberingAfterBreak="0">
+  <w:abstractNum w:abstractNumId="43" w15:restartNumberingAfterBreak="0">
     <w:nsid w:val="564F5B3D"/>
     <w:multiLevelType w:val="multilevel"/>
     <w:tmpl w:val="14569984"/>
@@ -13929,7 +16614,305 @@
       </w:rPr>
     </w:lvl>
   </w:abstractNum>
-  <w:abstractNum w:abstractNumId="38" w15:restartNumberingAfterBreak="0">
+  <w:abstractNum w:abstractNumId="44" w15:restartNumberingAfterBreak="0">
+    <w:nsid w:val="58A74FF0"/>
+    <w:multiLevelType w:val="multilevel"/>
+    <w:tmpl w:val="C1AA1DE6"/>
+    <w:lvl w:ilvl="0">
+      <w:start w:val="1"/>
+      <w:numFmt w:val="bullet"/>
+      <w:lvlText w:val=""/>
+      <w:lvlJc w:val="left"/>
+      <w:pPr>
+        <w:tabs>
+          <w:tab w:val="num" w:pos="720"/>
+        </w:tabs>
+        <w:ind w:left="720" w:hanging="360"/>
+      </w:pPr>
+      <w:rPr>
+        <w:rFonts w:ascii="Symbol" w:hAnsi="Symbol" w:hint="default"/>
+        <w:sz w:val="20"/>
+      </w:rPr>
+    </w:lvl>
+    <w:lvl w:ilvl="1" w:tentative="1">
+      <w:start w:val="1"/>
+      <w:numFmt w:val="bullet"/>
+      <w:lvlText w:val="o"/>
+      <w:lvlJc w:val="left"/>
+      <w:pPr>
+        <w:tabs>
+          <w:tab w:val="num" w:pos="1440"/>
+        </w:tabs>
+        <w:ind w:left="1440" w:hanging="360"/>
+      </w:pPr>
+      <w:rPr>
+        <w:rFonts w:ascii="Courier New" w:hAnsi="Courier New" w:hint="default"/>
+        <w:sz w:val="20"/>
+      </w:rPr>
+    </w:lvl>
+    <w:lvl w:ilvl="2" w:tentative="1">
+      <w:start w:val="1"/>
+      <w:numFmt w:val="bullet"/>
+      <w:lvlText w:val=""/>
+      <w:lvlJc w:val="left"/>
+      <w:pPr>
+        <w:tabs>
+          <w:tab w:val="num" w:pos="2160"/>
+        </w:tabs>
+        <w:ind w:left="2160" w:hanging="360"/>
+      </w:pPr>
+      <w:rPr>
+        <w:rFonts w:ascii="Wingdings" w:hAnsi="Wingdings" w:hint="default"/>
+        <w:sz w:val="20"/>
+      </w:rPr>
+    </w:lvl>
+    <w:lvl w:ilvl="3" w:tentative="1">
+      <w:start w:val="1"/>
+      <w:numFmt w:val="bullet"/>
+      <w:lvlText w:val=""/>
+      <w:lvlJc w:val="left"/>
+      <w:pPr>
+        <w:tabs>
+          <w:tab w:val="num" w:pos="2880"/>
+        </w:tabs>
+        <w:ind w:left="2880" w:hanging="360"/>
+      </w:pPr>
+      <w:rPr>
+        <w:rFonts w:ascii="Wingdings" w:hAnsi="Wingdings" w:hint="default"/>
+        <w:sz w:val="20"/>
+      </w:rPr>
+    </w:lvl>
+    <w:lvl w:ilvl="4" w:tentative="1">
+      <w:start w:val="1"/>
+      <w:numFmt w:val="bullet"/>
+      <w:lvlText w:val=""/>
+      <w:lvlJc w:val="left"/>
+      <w:pPr>
+        <w:tabs>
+          <w:tab w:val="num" w:pos="3600"/>
+        </w:tabs>
+        <w:ind w:left="3600" w:hanging="360"/>
+      </w:pPr>
+      <w:rPr>
+        <w:rFonts w:ascii="Wingdings" w:hAnsi="Wingdings" w:hint="default"/>
+        <w:sz w:val="20"/>
+      </w:rPr>
+    </w:lvl>
+    <w:lvl w:ilvl="5" w:tentative="1">
+      <w:start w:val="1"/>
+      <w:numFmt w:val="bullet"/>
+      <w:lvlText w:val=""/>
+      <w:lvlJc w:val="left"/>
+      <w:pPr>
+        <w:tabs>
+          <w:tab w:val="num" w:pos="4320"/>
+        </w:tabs>
+        <w:ind w:left="4320" w:hanging="360"/>
+      </w:pPr>
+      <w:rPr>
+        <w:rFonts w:ascii="Wingdings" w:hAnsi="Wingdings" w:hint="default"/>
+        <w:sz w:val="20"/>
+      </w:rPr>
+    </w:lvl>
+    <w:lvl w:ilvl="6" w:tentative="1">
+      <w:start w:val="1"/>
+      <w:numFmt w:val="bullet"/>
+      <w:lvlText w:val=""/>
+      <w:lvlJc w:val="left"/>
+      <w:pPr>
+        <w:tabs>
+          <w:tab w:val="num" w:pos="5040"/>
+        </w:tabs>
+        <w:ind w:left="5040" w:hanging="360"/>
+      </w:pPr>
+      <w:rPr>
+        <w:rFonts w:ascii="Wingdings" w:hAnsi="Wingdings" w:hint="default"/>
+        <w:sz w:val="20"/>
+      </w:rPr>
+    </w:lvl>
+    <w:lvl w:ilvl="7" w:tentative="1">
+      <w:start w:val="1"/>
+      <w:numFmt w:val="bullet"/>
+      <w:lvlText w:val=""/>
+      <w:lvlJc w:val="left"/>
+      <w:pPr>
+        <w:tabs>
+          <w:tab w:val="num" w:pos="5760"/>
+        </w:tabs>
+        <w:ind w:left="5760" w:hanging="360"/>
+      </w:pPr>
+      <w:rPr>
+        <w:rFonts w:ascii="Wingdings" w:hAnsi="Wingdings" w:hint="default"/>
+        <w:sz w:val="20"/>
+      </w:rPr>
+    </w:lvl>
+    <w:lvl w:ilvl="8" w:tentative="1">
+      <w:start w:val="1"/>
+      <w:numFmt w:val="bullet"/>
+      <w:lvlText w:val=""/>
+      <w:lvlJc w:val="left"/>
+      <w:pPr>
+        <w:tabs>
+          <w:tab w:val="num" w:pos="6480"/>
+        </w:tabs>
+        <w:ind w:left="6480" w:hanging="360"/>
+      </w:pPr>
+      <w:rPr>
+        <w:rFonts w:ascii="Wingdings" w:hAnsi="Wingdings" w:hint="default"/>
+        <w:sz w:val="20"/>
+      </w:rPr>
+    </w:lvl>
+  </w:abstractNum>
+  <w:abstractNum w:abstractNumId="45" w15:restartNumberingAfterBreak="0">
+    <w:nsid w:val="5C351A59"/>
+    <w:multiLevelType w:val="multilevel"/>
+    <w:tmpl w:val="0762A916"/>
+    <w:lvl w:ilvl="0">
+      <w:start w:val="1"/>
+      <w:numFmt w:val="bullet"/>
+      <w:lvlText w:val=""/>
+      <w:lvlJc w:val="left"/>
+      <w:pPr>
+        <w:tabs>
+          <w:tab w:val="num" w:pos="720"/>
+        </w:tabs>
+        <w:ind w:left="720" w:hanging="360"/>
+      </w:pPr>
+      <w:rPr>
+        <w:rFonts w:ascii="Symbol" w:hAnsi="Symbol" w:hint="default"/>
+        <w:sz w:val="20"/>
+      </w:rPr>
+    </w:lvl>
+    <w:lvl w:ilvl="1" w:tentative="1">
+      <w:start w:val="1"/>
+      <w:numFmt w:val="bullet"/>
+      <w:lvlText w:val="o"/>
+      <w:lvlJc w:val="left"/>
+      <w:pPr>
+        <w:tabs>
+          <w:tab w:val="num" w:pos="1440"/>
+        </w:tabs>
+        <w:ind w:left="1440" w:hanging="360"/>
+      </w:pPr>
+      <w:rPr>
+        <w:rFonts w:ascii="Courier New" w:hAnsi="Courier New" w:hint="default"/>
+        <w:sz w:val="20"/>
+      </w:rPr>
+    </w:lvl>
+    <w:lvl w:ilvl="2" w:tentative="1">
+      <w:start w:val="1"/>
+      <w:numFmt w:val="bullet"/>
+      <w:lvlText w:val=""/>
+      <w:lvlJc w:val="left"/>
+      <w:pPr>
+        <w:tabs>
+          <w:tab w:val="num" w:pos="2160"/>
+        </w:tabs>
+        <w:ind w:left="2160" w:hanging="360"/>
+      </w:pPr>
+      <w:rPr>
+        <w:rFonts w:ascii="Wingdings" w:hAnsi="Wingdings" w:hint="default"/>
+        <w:sz w:val="20"/>
+      </w:rPr>
+    </w:lvl>
+    <w:lvl w:ilvl="3" w:tentative="1">
+      <w:start w:val="1"/>
+      <w:numFmt w:val="bullet"/>
+      <w:lvlText w:val=""/>
+      <w:lvlJc w:val="left"/>
+      <w:pPr>
+        <w:tabs>
+          <w:tab w:val="num" w:pos="2880"/>
+        </w:tabs>
+        <w:ind w:left="2880" w:hanging="360"/>
+      </w:pPr>
+      <w:rPr>
+        <w:rFonts w:ascii="Wingdings" w:hAnsi="Wingdings" w:hint="default"/>
+        <w:sz w:val="20"/>
+      </w:rPr>
+    </w:lvl>
+    <w:lvl w:ilvl="4" w:tentative="1">
+      <w:start w:val="1"/>
+      <w:numFmt w:val="bullet"/>
+      <w:lvlText w:val=""/>
+      <w:lvlJc w:val="left"/>
+      <w:pPr>
+        <w:tabs>
+          <w:tab w:val="num" w:pos="3600"/>
+        </w:tabs>
+        <w:ind w:left="3600" w:hanging="360"/>
+      </w:pPr>
+      <w:rPr>
+        <w:rFonts w:ascii="Wingdings" w:hAnsi="Wingdings" w:hint="default"/>
+        <w:sz w:val="20"/>
+      </w:rPr>
+    </w:lvl>
+    <w:lvl w:ilvl="5" w:tentative="1">
+      <w:start w:val="1"/>
+      <w:numFmt w:val="bullet"/>
+      <w:lvlText w:val=""/>
+      <w:lvlJc w:val="left"/>
+      <w:pPr>
+        <w:tabs>
+          <w:tab w:val="num" w:pos="4320"/>
+        </w:tabs>
+        <w:ind w:left="4320" w:hanging="360"/>
+      </w:pPr>
+      <w:rPr>
+        <w:rFonts w:ascii="Wingdings" w:hAnsi="Wingdings" w:hint="default"/>
+        <w:sz w:val="20"/>
+      </w:rPr>
+    </w:lvl>
+    <w:lvl w:ilvl="6" w:tentative="1">
+      <w:start w:val="1"/>
+      <w:numFmt w:val="bullet"/>
+      <w:lvlText w:val=""/>
+      <w:lvlJc w:val="left"/>
+      <w:pPr>
+        <w:tabs>
+          <w:tab w:val="num" w:pos="5040"/>
+        </w:tabs>
+        <w:ind w:left="5040" w:hanging="360"/>
+      </w:pPr>
+      <w:rPr>
+        <w:rFonts w:ascii="Wingdings" w:hAnsi="Wingdings" w:hint="default"/>
+        <w:sz w:val="20"/>
+      </w:rPr>
+    </w:lvl>
+    <w:lvl w:ilvl="7" w:tentative="1">
+      <w:start w:val="1"/>
+      <w:numFmt w:val="bullet"/>
+      <w:lvlText w:val=""/>
+      <w:lvlJc w:val="left"/>
+      <w:pPr>
+        <w:tabs>
+          <w:tab w:val="num" w:pos="5760"/>
+        </w:tabs>
+        <w:ind w:left="5760" w:hanging="360"/>
+      </w:pPr>
+      <w:rPr>
+        <w:rFonts w:ascii="Wingdings" w:hAnsi="Wingdings" w:hint="default"/>
+        <w:sz w:val="20"/>
+      </w:rPr>
+    </w:lvl>
+    <w:lvl w:ilvl="8" w:tentative="1">
+      <w:start w:val="1"/>
+      <w:numFmt w:val="bullet"/>
+      <w:lvlText w:val=""/>
+      <w:lvlJc w:val="left"/>
+      <w:pPr>
+        <w:tabs>
+          <w:tab w:val="num" w:pos="6480"/>
+        </w:tabs>
+        <w:ind w:left="6480" w:hanging="360"/>
+      </w:pPr>
+      <w:rPr>
+        <w:rFonts w:ascii="Wingdings" w:hAnsi="Wingdings" w:hint="default"/>
+        <w:sz w:val="20"/>
+      </w:rPr>
+    </w:lvl>
+  </w:abstractNum>
+  <w:abstractNum w:abstractNumId="46" w15:restartNumberingAfterBreak="0">
     <w:nsid w:val="5D6117C1"/>
     <w:multiLevelType w:val="multilevel"/>
     <w:tmpl w:val="D8722C3E"/>
@@ -14078,7 +17061,7 @@
       </w:rPr>
     </w:lvl>
   </w:abstractNum>
-  <w:abstractNum w:abstractNumId="39" w15:restartNumberingAfterBreak="0">
+  <w:abstractNum w:abstractNumId="47" w15:restartNumberingAfterBreak="0">
     <w:nsid w:val="5D612191"/>
     <w:multiLevelType w:val="multilevel"/>
     <w:tmpl w:val="F104BFB8"/>
@@ -14191,7 +17174,7 @@
       </w:pPr>
     </w:lvl>
   </w:abstractNum>
-  <w:abstractNum w:abstractNumId="40" w15:restartNumberingAfterBreak="0">
+  <w:abstractNum w:abstractNumId="48" w15:restartNumberingAfterBreak="0">
     <w:nsid w:val="6454368F"/>
     <w:multiLevelType w:val="multilevel"/>
     <w:tmpl w:val="A8D480A4"/>
@@ -14340,7 +17323,156 @@
       </w:rPr>
     </w:lvl>
   </w:abstractNum>
-  <w:abstractNum w:abstractNumId="41" w15:restartNumberingAfterBreak="0">
+  <w:abstractNum w:abstractNumId="49" w15:restartNumberingAfterBreak="0">
+    <w:nsid w:val="681C3CED"/>
+    <w:multiLevelType w:val="multilevel"/>
+    <w:tmpl w:val="414668B0"/>
+    <w:lvl w:ilvl="0">
+      <w:start w:val="1"/>
+      <w:numFmt w:val="bullet"/>
+      <w:lvlText w:val=""/>
+      <w:lvlJc w:val="left"/>
+      <w:pPr>
+        <w:tabs>
+          <w:tab w:val="num" w:pos="720"/>
+        </w:tabs>
+        <w:ind w:left="720" w:hanging="360"/>
+      </w:pPr>
+      <w:rPr>
+        <w:rFonts w:ascii="Symbol" w:hAnsi="Symbol" w:hint="default"/>
+        <w:sz w:val="20"/>
+      </w:rPr>
+    </w:lvl>
+    <w:lvl w:ilvl="1" w:tentative="1">
+      <w:start w:val="1"/>
+      <w:numFmt w:val="bullet"/>
+      <w:lvlText w:val="o"/>
+      <w:lvlJc w:val="left"/>
+      <w:pPr>
+        <w:tabs>
+          <w:tab w:val="num" w:pos="1440"/>
+        </w:tabs>
+        <w:ind w:left="1440" w:hanging="360"/>
+      </w:pPr>
+      <w:rPr>
+        <w:rFonts w:ascii="Courier New" w:hAnsi="Courier New" w:hint="default"/>
+        <w:sz w:val="20"/>
+      </w:rPr>
+    </w:lvl>
+    <w:lvl w:ilvl="2" w:tentative="1">
+      <w:start w:val="1"/>
+      <w:numFmt w:val="bullet"/>
+      <w:lvlText w:val=""/>
+      <w:lvlJc w:val="left"/>
+      <w:pPr>
+        <w:tabs>
+          <w:tab w:val="num" w:pos="2160"/>
+        </w:tabs>
+        <w:ind w:left="2160" w:hanging="360"/>
+      </w:pPr>
+      <w:rPr>
+        <w:rFonts w:ascii="Wingdings" w:hAnsi="Wingdings" w:hint="default"/>
+        <w:sz w:val="20"/>
+      </w:rPr>
+    </w:lvl>
+    <w:lvl w:ilvl="3" w:tentative="1">
+      <w:start w:val="1"/>
+      <w:numFmt w:val="bullet"/>
+      <w:lvlText w:val=""/>
+      <w:lvlJc w:val="left"/>
+      <w:pPr>
+        <w:tabs>
+          <w:tab w:val="num" w:pos="2880"/>
+        </w:tabs>
+        <w:ind w:left="2880" w:hanging="360"/>
+      </w:pPr>
+      <w:rPr>
+        <w:rFonts w:ascii="Wingdings" w:hAnsi="Wingdings" w:hint="default"/>
+        <w:sz w:val="20"/>
+      </w:rPr>
+    </w:lvl>
+    <w:lvl w:ilvl="4" w:tentative="1">
+      <w:start w:val="1"/>
+      <w:numFmt w:val="bullet"/>
+      <w:lvlText w:val=""/>
+      <w:lvlJc w:val="left"/>
+      <w:pPr>
+        <w:tabs>
+          <w:tab w:val="num" w:pos="3600"/>
+        </w:tabs>
+        <w:ind w:left="3600" w:hanging="360"/>
+      </w:pPr>
+      <w:rPr>
+        <w:rFonts w:ascii="Wingdings" w:hAnsi="Wingdings" w:hint="default"/>
+        <w:sz w:val="20"/>
+      </w:rPr>
+    </w:lvl>
+    <w:lvl w:ilvl="5" w:tentative="1">
+      <w:start w:val="1"/>
+      <w:numFmt w:val="bullet"/>
+      <w:lvlText w:val=""/>
+      <w:lvlJc w:val="left"/>
+      <w:pPr>
+        <w:tabs>
+          <w:tab w:val="num" w:pos="4320"/>
+        </w:tabs>
+        <w:ind w:left="4320" w:hanging="360"/>
+      </w:pPr>
+      <w:rPr>
+        <w:rFonts w:ascii="Wingdings" w:hAnsi="Wingdings" w:hint="default"/>
+        <w:sz w:val="20"/>
+      </w:rPr>
+    </w:lvl>
+    <w:lvl w:ilvl="6" w:tentative="1">
+      <w:start w:val="1"/>
+      <w:numFmt w:val="bullet"/>
+      <w:lvlText w:val=""/>
+      <w:lvlJc w:val="left"/>
+      <w:pPr>
+        <w:tabs>
+          <w:tab w:val="num" w:pos="5040"/>
+        </w:tabs>
+        <w:ind w:left="5040" w:hanging="360"/>
+      </w:pPr>
+      <w:rPr>
+        <w:rFonts w:ascii="Wingdings" w:hAnsi="Wingdings" w:hint="default"/>
+        <w:sz w:val="20"/>
+      </w:rPr>
+    </w:lvl>
+    <w:lvl w:ilvl="7" w:tentative="1">
+      <w:start w:val="1"/>
+      <w:numFmt w:val="bullet"/>
+      <w:lvlText w:val=""/>
+      <w:lvlJc w:val="left"/>
+      <w:pPr>
+        <w:tabs>
+          <w:tab w:val="num" w:pos="5760"/>
+        </w:tabs>
+        <w:ind w:left="5760" w:hanging="360"/>
+      </w:pPr>
+      <w:rPr>
+        <w:rFonts w:ascii="Wingdings" w:hAnsi="Wingdings" w:hint="default"/>
+        <w:sz w:val="20"/>
+      </w:rPr>
+    </w:lvl>
+    <w:lvl w:ilvl="8" w:tentative="1">
+      <w:start w:val="1"/>
+      <w:numFmt w:val="bullet"/>
+      <w:lvlText w:val=""/>
+      <w:lvlJc w:val="left"/>
+      <w:pPr>
+        <w:tabs>
+          <w:tab w:val="num" w:pos="6480"/>
+        </w:tabs>
+        <w:ind w:left="6480" w:hanging="360"/>
+      </w:pPr>
+      <w:rPr>
+        <w:rFonts w:ascii="Wingdings" w:hAnsi="Wingdings" w:hint="default"/>
+        <w:sz w:val="20"/>
+      </w:rPr>
+    </w:lvl>
+  </w:abstractNum>
+  <w:abstractNum w:abstractNumId="50" w15:restartNumberingAfterBreak="0">
     <w:nsid w:val="6FEE5314"/>
     <w:multiLevelType w:val="multilevel"/>
     <w:tmpl w:val="CEF899C6"/>
@@ -14489,7 +17621,7 @@
       </w:rPr>
     </w:lvl>
   </w:abstractNum>
-  <w:abstractNum w:abstractNumId="42" w15:restartNumberingAfterBreak="0">
+  <w:abstractNum w:abstractNumId="51" w15:restartNumberingAfterBreak="0">
     <w:nsid w:val="71D7236C"/>
     <w:multiLevelType w:val="multilevel"/>
     <w:tmpl w:val="3C6EB1A0"/>
@@ -14638,7 +17770,7 @@
       </w:rPr>
     </w:lvl>
   </w:abstractNum>
-  <w:abstractNum w:abstractNumId="43" w15:restartNumberingAfterBreak="0">
+  <w:abstractNum w:abstractNumId="52" w15:restartNumberingAfterBreak="0">
     <w:nsid w:val="726263E0"/>
     <w:multiLevelType w:val="multilevel"/>
     <w:tmpl w:val="B3A095E6"/>
@@ -14787,7 +17919,7 @@
       </w:rPr>
     </w:lvl>
   </w:abstractNum>
-  <w:abstractNum w:abstractNumId="44" w15:restartNumberingAfterBreak="0">
+  <w:abstractNum w:abstractNumId="53" w15:restartNumberingAfterBreak="0">
     <w:nsid w:val="756C721D"/>
     <w:multiLevelType w:val="multilevel"/>
     <w:tmpl w:val="1BFCF236"/>
@@ -14936,7 +18068,7 @@
       </w:rPr>
     </w:lvl>
   </w:abstractNum>
-  <w:abstractNum w:abstractNumId="45" w15:restartNumberingAfterBreak="0">
+  <w:abstractNum w:abstractNumId="54" w15:restartNumberingAfterBreak="0">
     <w:nsid w:val="773D2929"/>
     <w:multiLevelType w:val="multilevel"/>
     <w:tmpl w:val="9B348D12"/>
@@ -15085,7 +18217,7 @@
       </w:rPr>
     </w:lvl>
   </w:abstractNum>
-  <w:abstractNum w:abstractNumId="46" w15:restartNumberingAfterBreak="0">
+  <w:abstractNum w:abstractNumId="55" w15:restartNumberingAfterBreak="0">
     <w:nsid w:val="7ABE239F"/>
     <w:multiLevelType w:val="multilevel"/>
     <w:tmpl w:val="7794F2A6"/>
@@ -15234,23 +18366,321 @@
       </w:rPr>
     </w:lvl>
   </w:abstractNum>
+  <w:abstractNum w:abstractNumId="56" w15:restartNumberingAfterBreak="0">
+    <w:nsid w:val="7AF25DEA"/>
+    <w:multiLevelType w:val="multilevel"/>
+    <w:tmpl w:val="6B7A7E06"/>
+    <w:lvl w:ilvl="0">
+      <w:start w:val="1"/>
+      <w:numFmt w:val="bullet"/>
+      <w:lvlText w:val=""/>
+      <w:lvlJc w:val="left"/>
+      <w:pPr>
+        <w:tabs>
+          <w:tab w:val="num" w:pos="720"/>
+        </w:tabs>
+        <w:ind w:left="720" w:hanging="360"/>
+      </w:pPr>
+      <w:rPr>
+        <w:rFonts w:ascii="Symbol" w:hAnsi="Symbol" w:hint="default"/>
+        <w:sz w:val="20"/>
+      </w:rPr>
+    </w:lvl>
+    <w:lvl w:ilvl="1">
+      <w:start w:val="1"/>
+      <w:numFmt w:val="bullet"/>
+      <w:lvlText w:val="o"/>
+      <w:lvlJc w:val="left"/>
+      <w:pPr>
+        <w:tabs>
+          <w:tab w:val="num" w:pos="1440"/>
+        </w:tabs>
+        <w:ind w:left="1440" w:hanging="360"/>
+      </w:pPr>
+      <w:rPr>
+        <w:rFonts w:ascii="Courier New" w:hAnsi="Courier New" w:hint="default"/>
+        <w:sz w:val="20"/>
+      </w:rPr>
+    </w:lvl>
+    <w:lvl w:ilvl="2" w:tentative="1">
+      <w:start w:val="1"/>
+      <w:numFmt w:val="bullet"/>
+      <w:lvlText w:val=""/>
+      <w:lvlJc w:val="left"/>
+      <w:pPr>
+        <w:tabs>
+          <w:tab w:val="num" w:pos="2160"/>
+        </w:tabs>
+        <w:ind w:left="2160" w:hanging="360"/>
+      </w:pPr>
+      <w:rPr>
+        <w:rFonts w:ascii="Wingdings" w:hAnsi="Wingdings" w:hint="default"/>
+        <w:sz w:val="20"/>
+      </w:rPr>
+    </w:lvl>
+    <w:lvl w:ilvl="3" w:tentative="1">
+      <w:start w:val="1"/>
+      <w:numFmt w:val="bullet"/>
+      <w:lvlText w:val=""/>
+      <w:lvlJc w:val="left"/>
+      <w:pPr>
+        <w:tabs>
+          <w:tab w:val="num" w:pos="2880"/>
+        </w:tabs>
+        <w:ind w:left="2880" w:hanging="360"/>
+      </w:pPr>
+      <w:rPr>
+        <w:rFonts w:ascii="Wingdings" w:hAnsi="Wingdings" w:hint="default"/>
+        <w:sz w:val="20"/>
+      </w:rPr>
+    </w:lvl>
+    <w:lvl w:ilvl="4" w:tentative="1">
+      <w:start w:val="1"/>
+      <w:numFmt w:val="bullet"/>
+      <w:lvlText w:val=""/>
+      <w:lvlJc w:val="left"/>
+      <w:pPr>
+        <w:tabs>
+          <w:tab w:val="num" w:pos="3600"/>
+        </w:tabs>
+        <w:ind w:left="3600" w:hanging="360"/>
+      </w:pPr>
+      <w:rPr>
+        <w:rFonts w:ascii="Wingdings" w:hAnsi="Wingdings" w:hint="default"/>
+        <w:sz w:val="20"/>
+      </w:rPr>
+    </w:lvl>
+    <w:lvl w:ilvl="5" w:tentative="1">
+      <w:start w:val="1"/>
+      <w:numFmt w:val="bullet"/>
+      <w:lvlText w:val=""/>
+      <w:lvlJc w:val="left"/>
+      <w:pPr>
+        <w:tabs>
+          <w:tab w:val="num" w:pos="4320"/>
+        </w:tabs>
+        <w:ind w:left="4320" w:hanging="360"/>
+      </w:pPr>
+      <w:rPr>
+        <w:rFonts w:ascii="Wingdings" w:hAnsi="Wingdings" w:hint="default"/>
+        <w:sz w:val="20"/>
+      </w:rPr>
+    </w:lvl>
+    <w:lvl w:ilvl="6" w:tentative="1">
+      <w:start w:val="1"/>
+      <w:numFmt w:val="bullet"/>
+      <w:lvlText w:val=""/>
+      <w:lvlJc w:val="left"/>
+      <w:pPr>
+        <w:tabs>
+          <w:tab w:val="num" w:pos="5040"/>
+        </w:tabs>
+        <w:ind w:left="5040" w:hanging="360"/>
+      </w:pPr>
+      <w:rPr>
+        <w:rFonts w:ascii="Wingdings" w:hAnsi="Wingdings" w:hint="default"/>
+        <w:sz w:val="20"/>
+      </w:rPr>
+    </w:lvl>
+    <w:lvl w:ilvl="7" w:tentative="1">
+      <w:start w:val="1"/>
+      <w:numFmt w:val="bullet"/>
+      <w:lvlText w:val=""/>
+      <w:lvlJc w:val="left"/>
+      <w:pPr>
+        <w:tabs>
+          <w:tab w:val="num" w:pos="5760"/>
+        </w:tabs>
+        <w:ind w:left="5760" w:hanging="360"/>
+      </w:pPr>
+      <w:rPr>
+        <w:rFonts w:ascii="Wingdings" w:hAnsi="Wingdings" w:hint="default"/>
+        <w:sz w:val="20"/>
+      </w:rPr>
+    </w:lvl>
+    <w:lvl w:ilvl="8" w:tentative="1">
+      <w:start w:val="1"/>
+      <w:numFmt w:val="bullet"/>
+      <w:lvlText w:val=""/>
+      <w:lvlJc w:val="left"/>
+      <w:pPr>
+        <w:tabs>
+          <w:tab w:val="num" w:pos="6480"/>
+        </w:tabs>
+        <w:ind w:left="6480" w:hanging="360"/>
+      </w:pPr>
+      <w:rPr>
+        <w:rFonts w:ascii="Wingdings" w:hAnsi="Wingdings" w:hint="default"/>
+        <w:sz w:val="20"/>
+      </w:rPr>
+    </w:lvl>
+  </w:abstractNum>
+  <w:abstractNum w:abstractNumId="57" w15:restartNumberingAfterBreak="0">
+    <w:nsid w:val="7BAD648A"/>
+    <w:multiLevelType w:val="multilevel"/>
+    <w:tmpl w:val="78E2068A"/>
+    <w:lvl w:ilvl="0">
+      <w:start w:val="1"/>
+      <w:numFmt w:val="bullet"/>
+      <w:lvlText w:val=""/>
+      <w:lvlJc w:val="left"/>
+      <w:pPr>
+        <w:tabs>
+          <w:tab w:val="num" w:pos="720"/>
+        </w:tabs>
+        <w:ind w:left="720" w:hanging="360"/>
+      </w:pPr>
+      <w:rPr>
+        <w:rFonts w:ascii="Symbol" w:hAnsi="Symbol" w:hint="default"/>
+        <w:sz w:val="20"/>
+      </w:rPr>
+    </w:lvl>
+    <w:lvl w:ilvl="1">
+      <w:start w:val="1"/>
+      <w:numFmt w:val="bullet"/>
+      <w:lvlText w:val="o"/>
+      <w:lvlJc w:val="left"/>
+      <w:pPr>
+        <w:tabs>
+          <w:tab w:val="num" w:pos="1440"/>
+        </w:tabs>
+        <w:ind w:left="1440" w:hanging="360"/>
+      </w:pPr>
+      <w:rPr>
+        <w:rFonts w:ascii="Courier New" w:hAnsi="Courier New" w:hint="default"/>
+        <w:sz w:val="20"/>
+      </w:rPr>
+    </w:lvl>
+    <w:lvl w:ilvl="2" w:tentative="1">
+      <w:start w:val="1"/>
+      <w:numFmt w:val="bullet"/>
+      <w:lvlText w:val=""/>
+      <w:lvlJc w:val="left"/>
+      <w:pPr>
+        <w:tabs>
+          <w:tab w:val="num" w:pos="2160"/>
+        </w:tabs>
+        <w:ind w:left="2160" w:hanging="360"/>
+      </w:pPr>
+      <w:rPr>
+        <w:rFonts w:ascii="Wingdings" w:hAnsi="Wingdings" w:hint="default"/>
+        <w:sz w:val="20"/>
+      </w:rPr>
+    </w:lvl>
+    <w:lvl w:ilvl="3" w:tentative="1">
+      <w:start w:val="1"/>
+      <w:numFmt w:val="bullet"/>
+      <w:lvlText w:val=""/>
+      <w:lvlJc w:val="left"/>
+      <w:pPr>
+        <w:tabs>
+          <w:tab w:val="num" w:pos="2880"/>
+        </w:tabs>
+        <w:ind w:left="2880" w:hanging="360"/>
+      </w:pPr>
+      <w:rPr>
+        <w:rFonts w:ascii="Wingdings" w:hAnsi="Wingdings" w:hint="default"/>
+        <w:sz w:val="20"/>
+      </w:rPr>
+    </w:lvl>
+    <w:lvl w:ilvl="4" w:tentative="1">
+      <w:start w:val="1"/>
+      <w:numFmt w:val="bullet"/>
+      <w:lvlText w:val=""/>
+      <w:lvlJc w:val="left"/>
+      <w:pPr>
+        <w:tabs>
+          <w:tab w:val="num" w:pos="3600"/>
+        </w:tabs>
+        <w:ind w:left="3600" w:hanging="360"/>
+      </w:pPr>
+      <w:rPr>
+        <w:rFonts w:ascii="Wingdings" w:hAnsi="Wingdings" w:hint="default"/>
+        <w:sz w:val="20"/>
+      </w:rPr>
+    </w:lvl>
+    <w:lvl w:ilvl="5" w:tentative="1">
+      <w:start w:val="1"/>
+      <w:numFmt w:val="bullet"/>
+      <w:lvlText w:val=""/>
+      <w:lvlJc w:val="left"/>
+      <w:pPr>
+        <w:tabs>
+          <w:tab w:val="num" w:pos="4320"/>
+        </w:tabs>
+        <w:ind w:left="4320" w:hanging="360"/>
+      </w:pPr>
+      <w:rPr>
+        <w:rFonts w:ascii="Wingdings" w:hAnsi="Wingdings" w:hint="default"/>
+        <w:sz w:val="20"/>
+      </w:rPr>
+    </w:lvl>
+    <w:lvl w:ilvl="6" w:tentative="1">
+      <w:start w:val="1"/>
+      <w:numFmt w:val="bullet"/>
+      <w:lvlText w:val=""/>
+      <w:lvlJc w:val="left"/>
+      <w:pPr>
+        <w:tabs>
+          <w:tab w:val="num" w:pos="5040"/>
+        </w:tabs>
+        <w:ind w:left="5040" w:hanging="360"/>
+      </w:pPr>
+      <w:rPr>
+        <w:rFonts w:ascii="Wingdings" w:hAnsi="Wingdings" w:hint="default"/>
+        <w:sz w:val="20"/>
+      </w:rPr>
+    </w:lvl>
+    <w:lvl w:ilvl="7" w:tentative="1">
+      <w:start w:val="1"/>
+      <w:numFmt w:val="bullet"/>
+      <w:lvlText w:val=""/>
+      <w:lvlJc w:val="left"/>
+      <w:pPr>
+        <w:tabs>
+          <w:tab w:val="num" w:pos="5760"/>
+        </w:tabs>
+        <w:ind w:left="5760" w:hanging="360"/>
+      </w:pPr>
+      <w:rPr>
+        <w:rFonts w:ascii="Wingdings" w:hAnsi="Wingdings" w:hint="default"/>
+        <w:sz w:val="20"/>
+      </w:rPr>
+    </w:lvl>
+    <w:lvl w:ilvl="8" w:tentative="1">
+      <w:start w:val="1"/>
+      <w:numFmt w:val="bullet"/>
+      <w:lvlText w:val=""/>
+      <w:lvlJc w:val="left"/>
+      <w:pPr>
+        <w:tabs>
+          <w:tab w:val="num" w:pos="6480"/>
+        </w:tabs>
+        <w:ind w:left="6480" w:hanging="360"/>
+      </w:pPr>
+      <w:rPr>
+        <w:rFonts w:ascii="Wingdings" w:hAnsi="Wingdings" w:hint="default"/>
+        <w:sz w:val="20"/>
+      </w:rPr>
+    </w:lvl>
+  </w:abstractNum>
   <w:num w:numId="1" w16cid:durableId="1130709215">
-    <w:abstractNumId w:val="21"/>
+    <w:abstractNumId w:val="25"/>
   </w:num>
   <w:num w:numId="2" w16cid:durableId="23795768">
-    <w:abstractNumId w:val="37"/>
+    <w:abstractNumId w:val="43"/>
   </w:num>
   <w:num w:numId="3" w16cid:durableId="1963073475">
-    <w:abstractNumId w:val="26"/>
+    <w:abstractNumId w:val="30"/>
   </w:num>
   <w:num w:numId="4" w16cid:durableId="1384938795">
-    <w:abstractNumId w:val="18"/>
+    <w:abstractNumId w:val="20"/>
   </w:num>
   <w:num w:numId="5" w16cid:durableId="1722751936">
-    <w:abstractNumId w:val="24"/>
+    <w:abstractNumId w:val="28"/>
   </w:num>
   <w:num w:numId="6" w16cid:durableId="1748335734">
-    <w:abstractNumId w:val="28"/>
+    <w:abstractNumId w:val="32"/>
   </w:num>
   <w:num w:numId="7" w16cid:durableId="23597620">
     <w:abstractNumId w:val="10"/>
@@ -15262,19 +18692,19 @@
     <w:abstractNumId w:val="8"/>
   </w:num>
   <w:num w:numId="10" w16cid:durableId="520628561">
-    <w:abstractNumId w:val="36"/>
+    <w:abstractNumId w:val="42"/>
   </w:num>
   <w:num w:numId="11" w16cid:durableId="495612247">
     <w:abstractNumId w:val="0"/>
   </w:num>
   <w:num w:numId="12" w16cid:durableId="1652904950">
-    <w:abstractNumId w:val="38"/>
+    <w:abstractNumId w:val="46"/>
   </w:num>
   <w:num w:numId="13" w16cid:durableId="300038676">
-    <w:abstractNumId w:val="27"/>
+    <w:abstractNumId w:val="31"/>
   </w:num>
   <w:num w:numId="14" w16cid:durableId="1407461748">
-    <w:abstractNumId w:val="30"/>
+    <w:abstractNumId w:val="36"/>
   </w:num>
   <w:num w:numId="15" w16cid:durableId="541554319">
     <w:abstractNumId w:val="7"/>
@@ -15289,7 +18719,7 @@
     <w:abstractNumId w:val="9"/>
   </w:num>
   <w:num w:numId="19" w16cid:durableId="1093428857">
-    <w:abstractNumId w:val="23"/>
+    <w:abstractNumId w:val="27"/>
   </w:num>
   <w:num w:numId="20" w16cid:durableId="1565919619">
     <w:abstractNumId w:val="1"/>
@@ -15298,7 +18728,7 @@
     <w:abstractNumId w:val="13"/>
   </w:num>
   <w:num w:numId="22" w16cid:durableId="1047798816">
-    <w:abstractNumId w:val="39"/>
+    <w:abstractNumId w:val="47"/>
   </w:num>
   <w:num w:numId="23" w16cid:durableId="1068721246">
     <w:abstractNumId w:val="2"/>
@@ -15307,73 +18737,106 @@
     <w:abstractNumId w:val="14"/>
   </w:num>
   <w:num w:numId="25" w16cid:durableId="1580939326">
-    <w:abstractNumId w:val="19"/>
+    <w:abstractNumId w:val="21"/>
   </w:num>
   <w:num w:numId="26" w16cid:durableId="1578520329">
-    <w:abstractNumId w:val="40"/>
+    <w:abstractNumId w:val="48"/>
   </w:num>
   <w:num w:numId="27" w16cid:durableId="871580165">
-    <w:abstractNumId w:val="35"/>
+    <w:abstractNumId w:val="41"/>
   </w:num>
   <w:num w:numId="28" w16cid:durableId="1843005253">
-    <w:abstractNumId w:val="42"/>
+    <w:abstractNumId w:val="51"/>
   </w:num>
   <w:num w:numId="29" w16cid:durableId="1958637488">
     <w:abstractNumId w:val="6"/>
   </w:num>
   <w:num w:numId="30" w16cid:durableId="766467481">
-    <w:abstractNumId w:val="17"/>
+    <w:abstractNumId w:val="19"/>
   </w:num>
   <w:num w:numId="31" w16cid:durableId="862784878">
     <w:abstractNumId w:val="3"/>
   </w:num>
   <w:num w:numId="32" w16cid:durableId="1913924236">
-    <w:abstractNumId w:val="41"/>
+    <w:abstractNumId w:val="50"/>
   </w:num>
   <w:num w:numId="33" w16cid:durableId="197666142">
-    <w:abstractNumId w:val="43"/>
+    <w:abstractNumId w:val="52"/>
   </w:num>
   <w:num w:numId="34" w16cid:durableId="778139693">
-    <w:abstractNumId w:val="31"/>
+    <w:abstractNumId w:val="37"/>
   </w:num>
   <w:num w:numId="35" w16cid:durableId="755831159">
     <w:abstractNumId w:val="15"/>
   </w:num>
   <w:num w:numId="36" w16cid:durableId="1639342421">
-    <w:abstractNumId w:val="22"/>
+    <w:abstractNumId w:val="26"/>
   </w:num>
   <w:num w:numId="37" w16cid:durableId="1442065380">
-    <w:abstractNumId w:val="20"/>
+    <w:abstractNumId w:val="23"/>
   </w:num>
   <w:num w:numId="38" w16cid:durableId="665281852">
-    <w:abstractNumId w:val="46"/>
+    <w:abstractNumId w:val="55"/>
   </w:num>
   <w:num w:numId="39" w16cid:durableId="1137801272">
-    <w:abstractNumId w:val="45"/>
+    <w:abstractNumId w:val="54"/>
   </w:num>
   <w:num w:numId="40" w16cid:durableId="491069678">
-    <w:abstractNumId w:val="32"/>
+    <w:abstractNumId w:val="38"/>
   </w:num>
   <w:num w:numId="41" w16cid:durableId="1203709384">
-    <w:abstractNumId w:val="44"/>
+    <w:abstractNumId w:val="53"/>
   </w:num>
   <w:num w:numId="42" w16cid:durableId="103158529">
     <w:abstractNumId w:val="12"/>
   </w:num>
   <w:num w:numId="43" w16cid:durableId="102967429">
+    <w:abstractNumId w:val="17"/>
+  </w:num>
+  <w:num w:numId="44" w16cid:durableId="1735815997">
+    <w:abstractNumId w:val="29"/>
+  </w:num>
+  <w:num w:numId="45" w16cid:durableId="897782202">
+    <w:abstractNumId w:val="33"/>
+  </w:num>
+  <w:num w:numId="46" w16cid:durableId="1386486376">
+    <w:abstractNumId w:val="40"/>
+  </w:num>
+  <w:num w:numId="47" w16cid:durableId="1842889970">
+    <w:abstractNumId w:val="39"/>
+  </w:num>
+  <w:num w:numId="48" w16cid:durableId="259947026">
+    <w:abstractNumId w:val="57"/>
+  </w:num>
+  <w:num w:numId="49" w16cid:durableId="1367296006">
+    <w:abstractNumId w:val="35"/>
+  </w:num>
+  <w:num w:numId="50" w16cid:durableId="683751632">
+    <w:abstractNumId w:val="45"/>
+  </w:num>
+  <w:num w:numId="51" w16cid:durableId="1499997855">
+    <w:abstractNumId w:val="18"/>
+  </w:num>
+  <w:num w:numId="52" w16cid:durableId="1603225229">
+    <w:abstractNumId w:val="49"/>
+  </w:num>
+  <w:num w:numId="53" w16cid:durableId="931552073">
+    <w:abstractNumId w:val="34"/>
+  </w:num>
+  <w:num w:numId="54" w16cid:durableId="356350124">
+    <w:abstractNumId w:val="22"/>
+  </w:num>
+  <w:num w:numId="55" w16cid:durableId="501745840">
     <w:abstractNumId w:val="16"/>
   </w:num>
-  <w:num w:numId="44" w16cid:durableId="1735815997">
-    <w:abstractNumId w:val="25"/>
+  <w:num w:numId="56" w16cid:durableId="457920038">
+    <w:abstractNumId w:val="56"/>
   </w:num>
-  <w:num w:numId="45" w16cid:durableId="897782202">
-    <w:abstractNumId w:val="29"/>
+  <w:num w:numId="57" w16cid:durableId="708337879">
+    <w:abstractNumId w:val="24"/>
   </w:num>
-  <w:num w:numId="46" w16cid:durableId="1386486376">
-    <w:abstractNumId w:val="34"/>
-  </w:num>
-  <w:num w:numId="47" w16cid:durableId="1842889970">
-    <w:abstractNumId w:val="33"/>
+  <w:num w:numId="58" w16cid:durableId="769862029">
+    <w:abstractNumId w:val="44"/>
   </w:num>
 </w:numbering>
 </file>

</xml_diff>